<commit_message>
docs(resume): critically rebuilt — accurate UTRDL bullets, stronger project selection, all 3 publications, CGPA added
</commit_message>
<xml_diff>
--- a/public/Tanvir_Ahmmed_Sifat_Resume.docx
+++ b/public/Tanvir_Ahmmed_Sifat_Resume.docx
@@ -4,7 +4,7 @@
   <w:body>
     <w:p>
       <w:pPr>
-        <w:spacing w:after="60" w:before="0"/>
+        <w:spacing w:after="40" w:before="0"/>
       </w:pPr>
       <w:r>
         <w:rPr>
@@ -12,9 +12,9 @@
           <w:b/>
           <w:bCs/>
           <w:color w:val="0F1A14"/>
-          <w:spacing w:val="20"/>
-          <w:sz w:val="44"/>
-          <w:szCs w:val="44"/>
+          <w:spacing w:val="30"/>
+          <w:sz w:val="46"/>
+          <w:szCs w:val="46"/>
         </w:rPr>
         <w:t xml:space="preserve">TANVIR AHMMED SIFAT</w:t>
       </w:r>
@@ -30,7 +30,7 @@
           <w:sz w:val="22"/>
           <w:szCs w:val="22"/>
         </w:rPr>
-        <w:t xml:space="preserve">Web Developer  ·  Full Stack Engineer  ·  AI Researcher</w:t>
+        <w:t xml:space="preserve">Web Developer  ·  Full-Stack Engineer  ·  Applied AI Researcher</w:t>
       </w:r>
     </w:p>
     <w:p>
@@ -97,12 +97,12 @@
         <w:pBdr>
           <w:top w:val="single" w:color="1A6647" w:sz="6" w:space="0"/>
         </w:pBdr>
-        <w:spacing w:after="0" w:before="0"/>
-      </w:pPr>
-    </w:p>
-    <w:p>
-      <w:pPr>
-        <w:spacing w:after="60" w:before="240"/>
+        <w:spacing w:after="0" w:before="220"/>
+      </w:pPr>
+    </w:p>
+    <w:p>
+      <w:pPr>
+        <w:spacing w:after="80" w:before="40"/>
       </w:pPr>
       <w:r>
         <w:rPr>
@@ -119,16 +119,16 @@
     </w:p>
     <w:p>
       <w:pPr>
-        <w:spacing w:after="40" w:before="0"/>
-      </w:pPr>
-      <w:r>
-        <w:rPr>
-          <w:rFonts w:ascii="Calibri" w:cs="Calibri" w:eastAsia="Calibri" w:hAnsi="Calibri"/>
-          <w:color w:val="0F1A14"/>
-          <w:sz w:val="20"/>
-          <w:szCs w:val="20"/>
-        </w:rPr>
-        <w:t xml:space="preserve">Web developer with 2+ years building and shipping production applications. I work across Angular, React, and Next.js frontends backed by Node.js and Express APIs — and I take those apps through to deployment. At UTRDL I've built client portals and dashboards for UK mortgage and real estate businesses, startup portals, and investor-facing platforms. On the side I've shipped several personal full-stack projects from scratch, including an MCQ assessment platform with server-authoritative grading and an AI personality tool. Currently completing an M.Sc. in ICT with 3 peer-reviewed publications in applied deep learning.</w:t>
+        <w:spacing w:after="0" w:before="0"/>
+      </w:pPr>
+      <w:r>
+        <w:rPr>
+          <w:rFonts w:ascii="Calibri" w:cs="Calibri" w:eastAsia="Calibri" w:hAnsi="Calibri"/>
+          <w:color w:val="1F2937"/>
+          <w:sz w:val="20"/>
+          <w:szCs w:val="20"/>
+        </w:rPr>
+        <w:t xml:space="preserve">Web developer with over two years building and maintaining production web applications using Angular, React, and Next.js. At UTRDL, implements frontend features and integrates APIs for client portals across finance, real estate, and venture capital. Has contributed to three paid client e-commerce platforms as part of collaborative teams. Completing an M.Sc. in ICT, with three peer-reviewed publications in applied deep learning.</w:t>
       </w:r>
     </w:p>
     <w:p>
@@ -136,12 +136,12 @@
         <w:pBdr>
           <w:top w:val="single" w:color="1A6647" w:sz="6" w:space="0"/>
         </w:pBdr>
-        <w:spacing w:after="0" w:before="0"/>
-      </w:pPr>
-    </w:p>
-    <w:p>
-      <w:pPr>
-        <w:spacing w:after="60" w:before="240"/>
+        <w:spacing w:after="0" w:before="220"/>
+      </w:pPr>
+    </w:p>
+    <w:p>
+      <w:pPr>
+        <w:spacing w:after="80" w:before="40"/>
       </w:pPr>
       <w:r>
         <w:rPr>
@@ -165,7 +165,7 @@
           <w:rFonts w:ascii="Calibri" w:cs="Calibri" w:eastAsia="Calibri" w:hAnsi="Calibri"/>
           <w:b/>
           <w:bCs/>
-          <w:color w:val="0F1A14"/>
+          <w:color w:val="1F2937"/>
           <w:sz w:val="20"/>
           <w:szCs w:val="20"/>
         </w:rPr>
@@ -174,7 +174,7 @@
       <w:r>
         <w:rPr>
           <w:rFonts w:ascii="Calibri" w:cs="Calibri" w:eastAsia="Calibri" w:hAnsi="Calibri"/>
-          <w:color w:val="374151"/>
+          <w:color w:val="4B5563"/>
           <w:sz w:val="20"/>
           <w:szCs w:val="20"/>
         </w:rPr>
@@ -190,7 +190,7 @@
           <w:rFonts w:ascii="Calibri" w:cs="Calibri" w:eastAsia="Calibri" w:hAnsi="Calibri"/>
           <w:b/>
           <w:bCs/>
-          <w:color w:val="0F1A14"/>
+          <w:color w:val="1F2937"/>
           <w:sz w:val="20"/>
           <w:szCs w:val="20"/>
         </w:rPr>
@@ -199,11 +199,11 @@
       <w:r>
         <w:rPr>
           <w:rFonts w:ascii="Calibri" w:cs="Calibri" w:eastAsia="Calibri" w:hAnsi="Calibri"/>
-          <w:color w:val="374151"/>
-          <w:sz w:val="20"/>
-          <w:szCs w:val="20"/>
-        </w:rPr>
-        <w:t xml:space="preserve">Node.js, Express.js, REST APIs, JWT Authentication, Payment Gateway Integration</w:t>
+          <w:color w:val="4B5563"/>
+          <w:sz w:val="20"/>
+          <w:szCs w:val="20"/>
+        </w:rPr>
+        <w:t xml:space="preserve">Node.js, Express.js, REST API integration, JWT authentication, payment gateway integration</w:t>
       </w:r>
     </w:p>
     <w:p>
@@ -215,7 +215,7 @@
           <w:rFonts w:ascii="Calibri" w:cs="Calibri" w:eastAsia="Calibri" w:hAnsi="Calibri"/>
           <w:b/>
           <w:bCs/>
-          <w:color w:val="0F1A14"/>
+          <w:color w:val="1F2937"/>
           <w:sz w:val="20"/>
           <w:szCs w:val="20"/>
         </w:rPr>
@@ -224,7 +224,7 @@
       <w:r>
         <w:rPr>
           <w:rFonts w:ascii="Calibri" w:cs="Calibri" w:eastAsia="Calibri" w:hAnsi="Calibri"/>
-          <w:color w:val="374151"/>
+          <w:color w:val="4B5563"/>
           <w:sz w:val="20"/>
           <w:szCs w:val="20"/>
         </w:rPr>
@@ -240,20 +240,20 @@
           <w:rFonts w:ascii="Calibri" w:cs="Calibri" w:eastAsia="Calibri" w:hAnsi="Calibri"/>
           <w:b/>
           <w:bCs/>
-          <w:color w:val="0F1A14"/>
-          <w:sz w:val="20"/>
-          <w:szCs w:val="20"/>
-        </w:rPr>
-        <w:t xml:space="preserve">Deployment: </w:t>
-      </w:r>
-      <w:r>
-        <w:rPr>
-          <w:rFonts w:ascii="Calibri" w:cs="Calibri" w:eastAsia="Calibri" w:hAnsi="Calibri"/>
-          <w:color w:val="374151"/>
-          <w:sz w:val="20"/>
-          <w:szCs w:val="20"/>
-        </w:rPr>
-        <w:t xml:space="preserve">Vercel, Azure VPS, IIS Server, cPanel, VPS, Git, GitHub</w:t>
+          <w:color w:val="1F2937"/>
+          <w:sz w:val="20"/>
+          <w:szCs w:val="20"/>
+        </w:rPr>
+        <w:t xml:space="preserve">Deployment &amp; Tools: </w:t>
+      </w:r>
+      <w:r>
+        <w:rPr>
+          <w:rFonts w:ascii="Calibri" w:cs="Calibri" w:eastAsia="Calibri" w:hAnsi="Calibri"/>
+          <w:color w:val="4B5563"/>
+          <w:sz w:val="20"/>
+          <w:szCs w:val="20"/>
+        </w:rPr>
+        <w:t xml:space="preserve">Git, GitHub, IIS Server, Vercel, Azure VPS, cPanel, VPS, Postman, Figma, Google Analytics</w:t>
       </w:r>
     </w:p>
     <w:p>
@@ -265,45 +265,20 @@
           <w:rFonts w:ascii="Calibri" w:cs="Calibri" w:eastAsia="Calibri" w:hAnsi="Calibri"/>
           <w:b/>
           <w:bCs/>
-          <w:color w:val="0F1A14"/>
-          <w:sz w:val="20"/>
-          <w:szCs w:val="20"/>
-        </w:rPr>
-        <w:t xml:space="preserve">Tools: </w:t>
-      </w:r>
-      <w:r>
-        <w:rPr>
-          <w:rFonts w:ascii="Calibri" w:cs="Calibri" w:eastAsia="Calibri" w:hAnsi="Calibri"/>
-          <w:color w:val="374151"/>
-          <w:sz w:val="20"/>
-          <w:szCs w:val="20"/>
-        </w:rPr>
-        <w:t xml:space="preserve">Postman, Figma, Jira, Google Analytics, Cloudinary</w:t>
-      </w:r>
-    </w:p>
-    <w:p>
-      <w:pPr>
-        <w:spacing w:after="40" w:before="0"/>
-      </w:pPr>
-      <w:r>
-        <w:rPr>
-          <w:rFonts w:ascii="Calibri" w:cs="Calibri" w:eastAsia="Calibri" w:hAnsi="Calibri"/>
-          <w:b/>
-          <w:bCs/>
-          <w:color w:val="0F1A14"/>
-          <w:sz w:val="20"/>
-          <w:szCs w:val="20"/>
-        </w:rPr>
-        <w:t xml:space="preserve">AI / ML: </w:t>
-      </w:r>
-      <w:r>
-        <w:rPr>
-          <w:rFonts w:ascii="Calibri" w:cs="Calibri" w:eastAsia="Calibri" w:hAnsi="Calibri"/>
-          <w:color w:val="374151"/>
-          <w:sz w:val="20"/>
-          <w:szCs w:val="20"/>
-        </w:rPr>
-        <w:t xml:space="preserve">Python, TensorFlow, Deep Learning, Computer Vision, Medical Image Analysis</w:t>
+          <w:color w:val="1F2937"/>
+          <w:sz w:val="20"/>
+          <w:szCs w:val="20"/>
+        </w:rPr>
+        <w:t xml:space="preserve">AI / ML &amp; Research: </w:t>
+      </w:r>
+      <w:r>
+        <w:rPr>
+          <w:rFonts w:ascii="Calibri" w:cs="Calibri" w:eastAsia="Calibri" w:hAnsi="Calibri"/>
+          <w:color w:val="4B5563"/>
+          <w:sz w:val="20"/>
+          <w:szCs w:val="20"/>
+        </w:rPr>
+        <w:t xml:space="preserve">Python, TensorFlow, deep learning, computer vision, medical image analysis</w:t>
       </w:r>
     </w:p>
     <w:p>
@@ -311,12 +286,12 @@
         <w:pBdr>
           <w:top w:val="single" w:color="1A6647" w:sz="6" w:space="0"/>
         </w:pBdr>
-        <w:spacing w:after="0" w:before="0"/>
-      </w:pPr>
-    </w:p>
-    <w:p>
-      <w:pPr>
-        <w:spacing w:after="60" w:before="240"/>
+        <w:spacing w:after="0" w:before="220"/>
+      </w:pPr>
+    </w:p>
+    <w:p>
+      <w:pPr>
+        <w:spacing w:after="80" w:before="40"/>
       </w:pPr>
       <w:r>
         <w:rPr>
@@ -343,20 +318,17 @@
           <w:rFonts w:ascii="Calibri" w:cs="Calibri" w:eastAsia="Calibri" w:hAnsi="Calibri"/>
           <w:b/>
           <w:bCs/>
-          <w:color w:val="0F1A14"/>
+          <w:color w:val="1F2937"/>
+          <w:sz w:val="23"/>
+          <w:szCs w:val="23"/>
+        </w:rPr>
+        <w:t xml:space="preserve">Web Developer</w:t>
+      </w:r>
+      <w:r>
+        <w:rPr>
           <w:sz w:val="22"/>
           <w:szCs w:val="22"/>
         </w:rPr>
-        <w:t xml:space="preserve">Web Developer</w:t>
-      </w:r>
-      <w:r>
-        <w:t xml:space="preserve"/>
-      </w:r>
-      <w:r>
-        <w:rPr>
-          <w:sz w:val="22"/>
-          <w:szCs w:val="22"/>
-        </w:rPr>
         <w:t xml:space="preserve">	</w:t>
       </w:r>
       <w:r>
@@ -364,23 +336,21 @@
           <w:rFonts w:ascii="Calibri" w:cs="Calibri" w:eastAsia="Calibri" w:hAnsi="Calibri"/>
           <w:i/>
           <w:iCs/>
-          <w:color w:val="6B7280"/>
-          <w:sz w:val="22"/>
-          <w:szCs w:val="22"/>
+          <w:color w:val="4B5563"/>
+          <w:sz w:val="20"/>
+          <w:szCs w:val="20"/>
         </w:rPr>
         <w:t xml:space="preserve">Jun 2024 — Present</w:t>
       </w:r>
     </w:p>
     <w:p>
       <w:pPr>
-        <w:spacing w:after="40" w:before="0"/>
-      </w:pPr>
-      <w:r>
-        <w:rPr>
-          <w:rFonts w:ascii="Calibri" w:cs="Calibri" w:eastAsia="Calibri" w:hAnsi="Calibri"/>
-          <w:i w:val="false"/>
-          <w:iCs w:val="false"/>
-          <w:color w:val="374151"/>
+        <w:spacing w:after="60" w:before="0"/>
+      </w:pPr>
+      <w:r>
+        <w:rPr>
+          <w:rFonts w:ascii="Calibri" w:cs="Calibri" w:eastAsia="Calibri" w:hAnsi="Calibri"/>
+          <w:color w:val="4B5563"/>
           <w:sz w:val="20"/>
           <w:szCs w:val="20"/>
         </w:rPr>
@@ -394,17 +364,17 @@
           <w:ilvl w:val="0"/>
           <w:numId w:val="1"/>
         </w:numPr>
-        <w:spacing w:after="30" w:before="0" w:line="240" w:lineRule="auto"/>
+        <w:spacing w:after="36" w:before="0" w:line="252" w:lineRule="auto"/>
         <w:ind w:left="360" w:hanging="180"/>
       </w:pPr>
       <w:r>
         <w:rPr>
           <w:rFonts w:ascii="Calibri" w:cs="Calibri" w:eastAsia="Calibri" w:hAnsi="Calibri"/>
-          <w:color w:val="0F1A14"/>
-          <w:sz w:val="20"/>
-          <w:szCs w:val="20"/>
-        </w:rPr>
-        <w:t xml:space="preserve">Build and maintain Angular and React/Next.js web apps and client portals for UK and UAE clients across finance, real estate, and venture capital.</w:t>
+          <w:color w:val="1F2937"/>
+          <w:sz w:val="20"/>
+          <w:szCs w:val="20"/>
+        </w:rPr>
+        <w:t xml:space="preserve">Implemented frontend features and workflow updates in Angular and React/Next.js across client applications for UK and UAE businesses in mortgage finance, commercial real estate, and venture capital.</w:t>
       </w:r>
     </w:p>
     <w:p>
@@ -414,17 +384,17 @@
           <w:ilvl w:val="0"/>
           <w:numId w:val="1"/>
         </w:numPr>
-        <w:spacing w:after="30" w:before="0" w:line="240" w:lineRule="auto"/>
+        <w:spacing w:after="36" w:before="0" w:line="252" w:lineRule="auto"/>
         <w:ind w:left="360" w:hanging="180"/>
       </w:pPr>
       <w:r>
         <w:rPr>
           <w:rFonts w:ascii="Calibri" w:cs="Calibri" w:eastAsia="Calibri" w:hAnsi="Calibri"/>
-          <w:color w:val="0F1A14"/>
-          <w:sz w:val="20"/>
-          <w:szCs w:val="20"/>
-        </w:rPr>
-        <w:t xml:space="preserve">Built customer portals and broker dashboards for UK mortgage platforms — loan calculators, multi-step application forms, and document upload flows.</w:t>
+          <w:color w:val="1F2937"/>
+          <w:sz w:val="20"/>
+          <w:szCs w:val="20"/>
+        </w:rPr>
+        <w:t xml:space="preserve">Built and maintained client portals including a mortgage broker dashboard with loan calculation tools, multi-step application forms, and document upload; and a commercial real estate platform with map-based property search and location filtering.</w:t>
       </w:r>
     </w:p>
     <w:p>
@@ -434,17 +404,17 @@
           <w:ilvl w:val="0"/>
           <w:numId w:val="1"/>
         </w:numPr>
-        <w:spacing w:after="30" w:before="0" w:line="240" w:lineRule="auto"/>
+        <w:spacing w:after="36" w:before="0" w:line="252" w:lineRule="auto"/>
         <w:ind w:left="360" w:hanging="180"/>
       </w:pPr>
       <w:r>
         <w:rPr>
           <w:rFonts w:ascii="Calibri" w:cs="Calibri" w:eastAsia="Calibri" w:hAnsi="Calibri"/>
-          <w:color w:val="0F1A14"/>
-          <w:sz w:val="20"/>
-          <w:szCs w:val="20"/>
-        </w:rPr>
-        <w:t xml:space="preserve">Developed the frontend for a commercial real estate platform with interactive map search, location filters, and property data views.</w:t>
+          <w:color w:val="1F2937"/>
+          <w:sz w:val="20"/>
+          <w:szCs w:val="20"/>
+        </w:rPr>
+        <w:t xml:space="preserve">Integrated REST APIs across application modules — handling data fetching, loading states, error handling, and coordinating API contract changes with the backend team as requirements evolved.</w:t>
       </w:r>
     </w:p>
     <w:p>
@@ -454,17 +424,73 @@
           <w:ilvl w:val="0"/>
           <w:numId w:val="1"/>
         </w:numPr>
-        <w:spacing w:after="30" w:before="0" w:line="240" w:lineRule="auto"/>
+        <w:spacing w:after="36" w:before="0" w:line="252" w:lineRule="auto"/>
         <w:ind w:left="360" w:hanging="180"/>
       </w:pPr>
       <w:r>
         <w:rPr>
           <w:rFonts w:ascii="Calibri" w:cs="Calibri" w:eastAsia="Calibri" w:hAnsi="Calibri"/>
-          <w:color w:val="0F1A14"/>
-          <w:sz w:val="20"/>
-          <w:szCs w:val="20"/>
-        </w:rPr>
-        <w:t xml:space="preserve">Created application workflows for a startup incubation portal and investor dashboards for venture capital and asset management firms.</w:t>
+          <w:color w:val="1F2937"/>
+          <w:sz w:val="20"/>
+          <w:szCs w:val="20"/>
+        </w:rPr>
+        <w:t xml:space="preserve">Built reusable UI component libraries to maintain visual consistency across projects, and managed production builds and deployments to IIS Server.</w:t>
+      </w:r>
+    </w:p>
+    <w:p>
+      <w:pPr>
+        <w:spacing w:after="60" w:before="0"/>
+      </w:pPr>
+    </w:p>
+    <w:p>
+      <w:pPr>
+        <w:tabs>
+          <w:tab w:val="right" w:pos="9026"/>
+        </w:tabs>
+        <w:spacing w:after="0" w:before="120"/>
+      </w:pPr>
+      <w:r>
+        <w:rPr>
+          <w:rFonts w:ascii="Calibri" w:cs="Calibri" w:eastAsia="Calibri" w:hAnsi="Calibri"/>
+          <w:b/>
+          <w:bCs/>
+          <w:color w:val="1F2937"/>
+          <w:sz w:val="23"/>
+          <w:szCs w:val="23"/>
+        </w:rPr>
+        <w:t xml:space="preserve">Full-Stack Developer</w:t>
+      </w:r>
+      <w:r>
+        <w:rPr>
+          <w:sz w:val="22"/>
+          <w:szCs w:val="22"/>
+        </w:rPr>
+        <w:t xml:space="preserve">	</w:t>
+      </w:r>
+      <w:r>
+        <w:rPr>
+          <w:rFonts w:ascii="Calibri" w:cs="Calibri" w:eastAsia="Calibri" w:hAnsi="Calibri"/>
+          <w:i/>
+          <w:iCs/>
+          <w:color w:val="4B5563"/>
+          <w:sz w:val="20"/>
+          <w:szCs w:val="20"/>
+        </w:rPr>
+        <w:t xml:space="preserve">2023 — Present</w:t>
+      </w:r>
+    </w:p>
+    <w:p>
+      <w:pPr>
+        <w:spacing w:after="60" w:before="0"/>
+      </w:pPr>
+      <w:r>
+        <w:rPr>
+          <w:rFonts w:ascii="Calibri" w:cs="Calibri" w:eastAsia="Calibri" w:hAnsi="Calibri"/>
+          <w:color w:val="4B5563"/>
+          <w:sz w:val="20"/>
+          <w:szCs w:val="20"/>
+        </w:rPr>
+        <w:t xml:space="preserve">Freelance &amp; Contract · Remote</w:t>
       </w:r>
     </w:p>
     <w:p>
@@ -474,78 +500,17 @@
           <w:ilvl w:val="0"/>
           <w:numId w:val="1"/>
         </w:numPr>
-        <w:spacing w:after="30" w:before="0" w:line="240" w:lineRule="auto"/>
+        <w:spacing w:after="36" w:before="0" w:line="252" w:lineRule="auto"/>
         <w:ind w:left="360" w:hanging="180"/>
       </w:pPr>
       <w:r>
         <w:rPr>
           <w:rFonts w:ascii="Calibri" w:cs="Calibri" w:eastAsia="Calibri" w:hAnsi="Calibri"/>
-          <w:color w:val="0F1A14"/>
-          <w:sz w:val="20"/>
-          <w:szCs w:val="20"/>
-        </w:rPr>
-        <w:t xml:space="preserve">Maintained reusable component libraries to keep UI consistent across projects, and handled production builds and deployments on IIS Server.</w:t>
-      </w:r>
-    </w:p>
-    <w:p>
-      <w:pPr>
-        <w:spacing w:after="0" w:before="80"/>
-      </w:pPr>
-    </w:p>
-    <w:p>
-      <w:pPr>
-        <w:tabs>
-          <w:tab w:val="right" w:pos="9026"/>
-        </w:tabs>
-        <w:spacing w:after="0" w:before="120"/>
-      </w:pPr>
-      <w:r>
-        <w:rPr>
-          <w:rFonts w:ascii="Calibri" w:cs="Calibri" w:eastAsia="Calibri" w:hAnsi="Calibri"/>
-          <w:b/>
-          <w:bCs/>
-          <w:color w:val="0F1A14"/>
-          <w:sz w:val="22"/>
-          <w:szCs w:val="22"/>
-        </w:rPr>
-        <w:t xml:space="preserve">Full Stack Developer</w:t>
-      </w:r>
-      <w:r>
-        <w:t xml:space="preserve"/>
-      </w:r>
-      <w:r>
-        <w:rPr>
-          <w:sz w:val="22"/>
-          <w:szCs w:val="22"/>
-        </w:rPr>
-        <w:t xml:space="preserve">	</w:t>
-      </w:r>
-      <w:r>
-        <w:rPr>
-          <w:rFonts w:ascii="Calibri" w:cs="Calibri" w:eastAsia="Calibri" w:hAnsi="Calibri"/>
-          <w:i/>
-          <w:iCs/>
-          <w:color w:val="6B7280"/>
-          <w:sz w:val="22"/>
-          <w:szCs w:val="22"/>
-        </w:rPr>
-        <w:t xml:space="preserve">2023 — Present</w:t>
-      </w:r>
-    </w:p>
-    <w:p>
-      <w:pPr>
-        <w:spacing w:after="40" w:before="0"/>
-      </w:pPr>
-      <w:r>
-        <w:rPr>
-          <w:rFonts w:ascii="Calibri" w:cs="Calibri" w:eastAsia="Calibri" w:hAnsi="Calibri"/>
-          <w:i w:val="false"/>
-          <w:iCs w:val="false"/>
-          <w:color w:val="374151"/>
-          <w:sz w:val="20"/>
-          <w:szCs w:val="20"/>
-        </w:rPr>
-        <w:t xml:space="preserve">Freelance &amp; Contract · Remote</w:t>
+          <w:color w:val="1F2937"/>
+          <w:sz w:val="20"/>
+          <w:szCs w:val="20"/>
+        </w:rPr>
+        <w:t xml:space="preserve">Contributed to three paid client e-commerce platforms in three-person development teams, working across Next.js and React frontends and Node.js/Express REST APIs.</w:t>
       </w:r>
     </w:p>
     <w:p>
@@ -555,17 +520,17 @@
           <w:ilvl w:val="0"/>
           <w:numId w:val="1"/>
         </w:numPr>
-        <w:spacing w:after="30" w:before="0" w:line="240" w:lineRule="auto"/>
+        <w:spacing w:after="36" w:before="0" w:line="252" w:lineRule="auto"/>
         <w:ind w:left="360" w:hanging="180"/>
       </w:pPr>
       <w:r>
         <w:rPr>
           <w:rFonts w:ascii="Calibri" w:cs="Calibri" w:eastAsia="Calibri" w:hAnsi="Calibri"/>
-          <w:color w:val="0F1A14"/>
-          <w:sz w:val="20"/>
-          <w:szCs w:val="20"/>
-        </w:rPr>
-        <w:t xml:space="preserve">Delivered three paid client e-commerce platforms in small development teams — React and Next.js frontends connected to Express REST APIs.</w:t>
+          <w:color w:val="1F2937"/>
+          <w:sz w:val="20"/>
+          <w:szCs w:val="20"/>
+        </w:rPr>
+        <w:t xml:space="preserve">Implemented authentication flows, product and order management, multi-vendor dashboards, and cart-to-checkout workflows; configured SEO metadata and Google Analytics for client storefronts.</w:t>
       </w:r>
     </w:p>
     <w:p>
@@ -575,17 +540,97 @@
           <w:ilvl w:val="0"/>
           <w:numId w:val="1"/>
         </w:numPr>
-        <w:spacing w:after="30" w:before="0" w:line="240" w:lineRule="auto"/>
+        <w:spacing w:after="36" w:before="0" w:line="252" w:lineRule="auto"/>
         <w:ind w:left="360" w:hanging="180"/>
       </w:pPr>
       <w:r>
         <w:rPr>
           <w:rFonts w:ascii="Calibri" w:cs="Calibri" w:eastAsia="Calibri" w:hAnsi="Calibri"/>
-          <w:color w:val="0F1A14"/>
-          <w:sz w:val="20"/>
-          <w:szCs w:val="20"/>
-        </w:rPr>
-        <w:t xml:space="preserve">Worked across authentication, product management, order workflows, multi-vendor dashboards, and catalog search.</w:t>
+          <w:color w:val="1F2937"/>
+          <w:sz w:val="20"/>
+          <w:szCs w:val="20"/>
+        </w:rPr>
+        <w:t xml:space="preserve">Deployed and configured applications on cPanel, VPS, and Azure for live production traffic.</w:t>
+      </w:r>
+    </w:p>
+    <w:p>
+      <w:pPr>
+        <w:pBdr>
+          <w:top w:val="single" w:color="1A6647" w:sz="6" w:space="0"/>
+        </w:pBdr>
+        <w:spacing w:after="0" w:before="220"/>
+      </w:pPr>
+    </w:p>
+    <w:p>
+      <w:pPr>
+        <w:spacing w:after="80" w:before="40"/>
+      </w:pPr>
+      <w:r>
+        <w:rPr>
+          <w:rFonts w:ascii="Calibri" w:cs="Calibri" w:eastAsia="Calibri" w:hAnsi="Calibri"/>
+          <w:b/>
+          <w:bCs/>
+          <w:color w:val="1A6647"/>
+          <w:spacing w:val="40"/>
+          <w:sz w:val="20"/>
+          <w:szCs w:val="20"/>
+        </w:rPr>
+        <w:t xml:space="preserve">SELECTED PROJECTS</w:t>
+      </w:r>
+    </w:p>
+    <w:p>
+      <w:pPr>
+        <w:tabs>
+          <w:tab w:val="right" w:pos="9026"/>
+        </w:tabs>
+        <w:spacing w:after="0" w:before="120"/>
+      </w:pPr>
+      <w:r>
+        <w:rPr>
+          <w:rFonts w:ascii="Calibri" w:cs="Calibri" w:eastAsia="Calibri" w:hAnsi="Calibri"/>
+          <w:b/>
+          <w:bCs/>
+          <w:color w:val="1F2937"/>
+          <w:sz w:val="21"/>
+          <w:szCs w:val="21"/>
+        </w:rPr>
+        <w:t xml:space="preserve">Bazarica — Multi-Vendor Marketplace</w:t>
+      </w:r>
+      <w:r>
+        <w:rPr>
+          <w:rFonts w:ascii="Calibri" w:cs="Calibri" w:eastAsia="Calibri" w:hAnsi="Calibri"/>
+          <w:color w:val="6B7280"/>
+          <w:sz w:val="20"/>
+          <w:szCs w:val="20"/>
+        </w:rPr>
+        <w:t xml:space="preserve">  ·  </w:t>
+      </w:r>
+      <w:r>
+        <w:rPr>
+          <w:rFonts w:ascii="Calibri" w:cs="Calibri" w:eastAsia="Calibri" w:hAnsi="Calibri"/>
+          <w:color w:val="1A6647"/>
+          <w:sz w:val="20"/>
+          <w:szCs w:val="20"/>
+        </w:rPr>
+        <w:t xml:space="preserve">bazarica.com.bd</w:t>
+      </w:r>
+      <w:r>
+        <w:rPr>
+          <w:sz w:val="20"/>
+          <w:szCs w:val="20"/>
+        </w:rPr>
+        <w:t xml:space="preserve">	</w:t>
+      </w:r>
+      <w:r>
+        <w:rPr>
+          <w:rFonts w:ascii="Calibri" w:cs="Calibri" w:eastAsia="Calibri" w:hAnsi="Calibri"/>
+          <w:i/>
+          <w:iCs/>
+          <w:color w:val="6B7280"/>
+          <w:sz w:val="18"/>
+          <w:szCs w:val="18"/>
+        </w:rPr>
+        <w:t xml:space="preserve">Next.js · Express.js · MongoDB · Azure VPS</w:t>
       </w:r>
     </w:p>
     <w:p>
@@ -595,61 +640,61 @@
           <w:ilvl w:val="0"/>
           <w:numId w:val="1"/>
         </w:numPr>
-        <w:spacing w:after="30" w:before="0" w:line="240" w:lineRule="auto"/>
+        <w:spacing w:after="36" w:before="0" w:line="252" w:lineRule="auto"/>
         <w:ind w:left="360" w:hanging="180"/>
       </w:pPr>
       <w:r>
         <w:rPr>
           <w:rFonts w:ascii="Calibri" w:cs="Calibri" w:eastAsia="Calibri" w:hAnsi="Calibri"/>
-          <w:color w:val="0F1A14"/>
-          <w:sz w:val="20"/>
-          <w:szCs w:val="20"/>
-        </w:rPr>
-        <w:t xml:space="preserve">Deployed to cPanel, VPS, and Azure; set up SEO metadata and Google Analytics for live client storefronts.</w:t>
-      </w:r>
-    </w:p>
-    <w:p>
-      <w:pPr>
-        <w:pBdr>
-          <w:top w:val="single" w:color="1A6647" w:sz="6" w:space="0"/>
-        </w:pBdr>
-        <w:spacing w:after="0" w:before="0"/>
-      </w:pPr>
-    </w:p>
-    <w:p>
-      <w:pPr>
-        <w:spacing w:after="60" w:before="240"/>
-      </w:pPr>
-      <w:r>
-        <w:rPr>
-          <w:rFonts w:ascii="Calibri" w:cs="Calibri" w:eastAsia="Calibri" w:hAnsi="Calibri"/>
-          <w:b/>
-          <w:bCs/>
-          <w:color w:val="1A6647"/>
-          <w:spacing w:val="40"/>
-          <w:sz w:val="20"/>
-          <w:szCs w:val="20"/>
-        </w:rPr>
-        <w:t xml:space="preserve">PROJECTS</w:t>
-      </w:r>
+          <w:color w:val="1F2937"/>
+          <w:sz w:val="20"/>
+          <w:szCs w:val="20"/>
+        </w:rPr>
+        <w:t xml:space="preserve">Production marketplace where independent sellers manage their own product listings and orders through separate seller, admin, and customer interfaces — each with role-specific views and permissions.</w:t>
+      </w:r>
+    </w:p>
+    <w:p>
+      <w:pPr>
+        <w:pStyle w:val="ListParagraph"/>
+        <w:numPr>
+          <w:ilvl w:val="0"/>
+          <w:numId w:val="1"/>
+        </w:numPr>
+        <w:spacing w:after="36" w:before="0" w:line="252" w:lineRule="auto"/>
+        <w:ind w:left="360" w:hanging="180"/>
+      </w:pPr>
+      <w:r>
+        <w:rPr>
+          <w:rFonts w:ascii="Calibri" w:cs="Calibri" w:eastAsia="Calibri" w:hAnsi="Calibri"/>
+          <w:color w:val="1F2937"/>
+          <w:sz w:val="20"/>
+          <w:szCs w:val="20"/>
+        </w:rPr>
+        <w:t xml:space="preserve">Contributed role-based dashboard views, integrated payment and order confirmation flows, implemented cross-vendor catalog search, wired SEO metadata and Google Analytics, and deployed to Azure VPS.</w:t>
+      </w:r>
+    </w:p>
+    <w:p>
+      <w:pPr>
+        <w:spacing w:after="50" w:before="0"/>
+      </w:pPr>
     </w:p>
     <w:p>
       <w:pPr>
         <w:tabs>
           <w:tab w:val="right" w:pos="9026"/>
         </w:tabs>
-        <w:spacing w:after="20" w:before="100"/>
-      </w:pPr>
-      <w:r>
-        <w:rPr>
-          <w:rFonts w:ascii="Calibri" w:cs="Calibri" w:eastAsia="Calibri" w:hAnsi="Calibri"/>
-          <w:b/>
-          <w:bCs/>
-          <w:color w:val="0F1A14"/>
-          <w:sz w:val="20"/>
-          <w:szCs w:val="20"/>
-        </w:rPr>
-        <w:t xml:space="preserve">Bazarica — Multi-Vendor Marketplace</w:t>
+        <w:spacing w:after="0" w:before="120"/>
+      </w:pPr>
+      <w:r>
+        <w:rPr>
+          <w:rFonts w:ascii="Calibri" w:cs="Calibri" w:eastAsia="Calibri" w:hAnsi="Calibri"/>
+          <w:b/>
+          <w:bCs/>
+          <w:color w:val="1F2937"/>
+          <w:sz w:val="21"/>
+          <w:szCs w:val="21"/>
+        </w:rPr>
+        <w:t xml:space="preserve">Nirnoy — MCQ Exam Platform</w:t>
       </w:r>
       <w:r>
         <w:rPr>
@@ -658,7 +703,7 @@
           <w:sz w:val="20"/>
           <w:szCs w:val="20"/>
         </w:rPr>
-        <w:t xml:space="preserve">  —  </w:t>
+        <w:t xml:space="preserve">  ·  </w:t>
       </w:r>
       <w:r>
         <w:rPr>
@@ -667,7 +712,7 @@
           <w:sz w:val="20"/>
           <w:szCs w:val="20"/>
         </w:rPr>
-        <w:t xml:space="preserve">bazarica.com.bd</w:t>
+        <w:t xml:space="preserve">nirnoy.vercel.app</w:t>
       </w:r>
       <w:r>
         <w:rPr>
@@ -685,7 +730,7 @@
           <w:sz w:val="18"/>
           <w:szCs w:val="18"/>
         </w:rPr>
-        <w:t xml:space="preserve">Next.js · Express.js · MongoDB · Azure VPS</w:t>
+        <w:t xml:space="preserve">React · Express.js · MongoDB · Tailwind CSS</w:t>
       </w:r>
     </w:p>
     <w:p>
@@ -695,17 +740,17 @@
           <w:ilvl w:val="0"/>
           <w:numId w:val="1"/>
         </w:numPr>
-        <w:spacing w:after="30" w:before="0" w:line="240" w:lineRule="auto"/>
+        <w:spacing w:after="36" w:before="0" w:line="252" w:lineRule="auto"/>
         <w:ind w:left="360" w:hanging="180"/>
       </w:pPr>
       <w:r>
         <w:rPr>
           <w:rFonts w:ascii="Calibri" w:cs="Calibri" w:eastAsia="Calibri" w:hAnsi="Calibri"/>
-          <w:color w:val="0F1A14"/>
-          <w:sz w:val="20"/>
-          <w:szCs w:val="20"/>
-        </w:rPr>
-        <w:t xml:space="preserve">Live multi-vendor marketplace where independent sellers list and sell products, with separate admin, seller, and customer experiences.</w:t>
+          <w:color w:val="1F2937"/>
+          <w:sz w:val="20"/>
+          <w:szCs w:val="20"/>
+        </w:rPr>
+        <w:t xml:space="preserve">Exam platform for students where question delivery, timing, and grading are controlled server-side — answer data is stripped before being sent to the client, so submissions cannot be pre-populated or inspected in the browser.</w:t>
       </w:r>
     </w:p>
     <w:p>
@@ -715,17 +760,77 @@
           <w:ilvl w:val="0"/>
           <w:numId w:val="1"/>
         </w:numPr>
-        <w:spacing w:after="30" w:before="0" w:line="240" w:lineRule="auto"/>
+        <w:spacing w:after="36" w:before="0" w:line="252" w:lineRule="auto"/>
         <w:ind w:left="360" w:hanging="180"/>
       </w:pPr>
       <w:r>
         <w:rPr>
           <w:rFonts w:ascii="Calibri" w:cs="Calibri" w:eastAsia="Calibri" w:hAnsi="Calibri"/>
-          <w:color w:val="0F1A14"/>
-          <w:sz w:val="20"/>
-          <w:szCs w:val="20"/>
-        </w:rPr>
-        <w:t xml:space="preserve">Built role-based dashboards for all three user types, integrated the payment gateway and order confirmation flow, and implemented catalog search across vendors.</w:t>
+          <w:color w:val="1F2937"/>
+          <w:sz w:val="20"/>
+          <w:szCs w:val="20"/>
+        </w:rPr>
+        <w:t xml:space="preserve">Built an admin interface for JSON-based exam creation and CSV export; implemented per-student result storage and retrieval, attempt history, and per-exam leaderboards.</w:t>
+      </w:r>
+    </w:p>
+    <w:p>
+      <w:pPr>
+        <w:spacing w:after="50" w:before="0"/>
+      </w:pPr>
+    </w:p>
+    <w:p>
+      <w:pPr>
+        <w:tabs>
+          <w:tab w:val="right" w:pos="9026"/>
+        </w:tabs>
+        <w:spacing w:after="0" w:before="120"/>
+      </w:pPr>
+      <w:r>
+        <w:rPr>
+          <w:rFonts w:ascii="Calibri" w:cs="Calibri" w:eastAsia="Calibri" w:hAnsi="Calibri"/>
+          <w:b/>
+          <w:bCs/>
+          <w:color w:val="1F2937"/>
+          <w:sz w:val="21"/>
+          <w:szCs w:val="21"/>
+        </w:rPr>
+        <w:t xml:space="preserve">Outfitro — Fashion E-Commerce</w:t>
+      </w:r>
+      <w:r>
+        <w:rPr>
+          <w:rFonts w:ascii="Calibri" w:cs="Calibri" w:eastAsia="Calibri" w:hAnsi="Calibri"/>
+          <w:color w:val="6B7280"/>
+          <w:sz w:val="20"/>
+          <w:szCs w:val="20"/>
+        </w:rPr>
+        <w:t xml:space="preserve">  ·  </w:t>
+      </w:r>
+      <w:r>
+        <w:rPr>
+          <w:rFonts w:ascii="Calibri" w:cs="Calibri" w:eastAsia="Calibri" w:hAnsi="Calibri"/>
+          <w:color w:val="1A6647"/>
+          <w:sz w:val="20"/>
+          <w:szCs w:val="20"/>
+        </w:rPr>
+        <w:t xml:space="preserve">outfitro.com</w:t>
+      </w:r>
+      <w:r>
+        <w:rPr>
+          <w:sz w:val="20"/>
+          <w:szCs w:val="20"/>
+        </w:rPr>
+        <w:t xml:space="preserve">	</w:t>
+      </w:r>
+      <w:r>
+        <w:rPr>
+          <w:rFonts w:ascii="Calibri" w:cs="Calibri" w:eastAsia="Calibri" w:hAnsi="Calibri"/>
+          <w:i/>
+          <w:iCs/>
+          <w:color w:val="6B7280"/>
+          <w:sz w:val="18"/>
+          <w:szCs w:val="18"/>
+        </w:rPr>
+        <w:t xml:space="preserve">React · Express.js · Node.js · MongoDB · cPanel</w:t>
       </w:r>
     </w:p>
     <w:p>
@@ -735,22 +840,22 @@
           <w:ilvl w:val="0"/>
           <w:numId w:val="1"/>
         </w:numPr>
-        <w:spacing w:after="30" w:before="0" w:line="240" w:lineRule="auto"/>
+        <w:spacing w:after="36" w:before="0" w:line="252" w:lineRule="auto"/>
         <w:ind w:left="360" w:hanging="180"/>
       </w:pPr>
       <w:r>
         <w:rPr>
           <w:rFonts w:ascii="Calibri" w:cs="Calibri" w:eastAsia="Calibri" w:hAnsi="Calibri"/>
-          <w:color w:val="0F1A14"/>
-          <w:sz w:val="20"/>
-          <w:szCs w:val="20"/>
-        </w:rPr>
-        <w:t xml:space="preserve">Set up SEO metadata and Google Analytics, then deployed and configured the app on Azure VPS.</w:t>
-      </w:r>
-    </w:p>
-    <w:p>
-      <w:pPr>
-        <w:spacing w:after="0" w:before="60"/>
+          <w:color w:val="1F2937"/>
+          <w:sz w:val="20"/>
+          <w:szCs w:val="20"/>
+        </w:rPr>
+        <w:t xml:space="preserve">Contributed to a full-stack fashion storefront as part of a three-person paid client team: built storefront pages and product views in React, developed REST endpoints on the Express API, and implemented authentication and the cart-to-checkout flow.</w:t>
+      </w:r>
+    </w:p>
+    <w:p>
+      <w:pPr>
+        <w:spacing w:after="50" w:before="0"/>
       </w:pPr>
     </w:p>
     <w:p>
@@ -758,18 +863,18 @@
         <w:tabs>
           <w:tab w:val="right" w:pos="9026"/>
         </w:tabs>
-        <w:spacing w:after="20" w:before="100"/>
-      </w:pPr>
-      <w:r>
-        <w:rPr>
-          <w:rFonts w:ascii="Calibri" w:cs="Calibri" w:eastAsia="Calibri" w:hAnsi="Calibri"/>
-          <w:b/>
-          <w:bCs/>
-          <w:color w:val="0F1A14"/>
-          <w:sz w:val="20"/>
-          <w:szCs w:val="20"/>
-        </w:rPr>
-        <w:t xml:space="preserve">Nirnoy — MCQ Exam &amp; Assessment Platform</w:t>
+        <w:spacing w:after="0" w:before="120"/>
+      </w:pPr>
+      <w:r>
+        <w:rPr>
+          <w:rFonts w:ascii="Calibri" w:cs="Calibri" w:eastAsia="Calibri" w:hAnsi="Calibri"/>
+          <w:b/>
+          <w:bCs/>
+          <w:color w:val="1F2937"/>
+          <w:sz w:val="21"/>
+          <w:szCs w:val="21"/>
+        </w:rPr>
+        <w:t xml:space="preserve">SelfMatrix — Personality Assessment Tool</w:t>
       </w:r>
       <w:r>
         <w:rPr>
@@ -778,7 +883,7 @@
           <w:sz w:val="20"/>
           <w:szCs w:val="20"/>
         </w:rPr>
-        <w:t xml:space="preserve">  —  </w:t>
+        <w:t xml:space="preserve">  ·  </w:t>
       </w:r>
       <w:r>
         <w:rPr>
@@ -787,7 +892,7 @@
           <w:sz w:val="20"/>
           <w:szCs w:val="20"/>
         </w:rPr>
-        <w:t xml:space="preserve">nirnoy.vercel.app</w:t>
+        <w:t xml:space="preserve">selfmatrix.vercel.app</w:t>
       </w:r>
       <w:r>
         <w:rPr>
@@ -805,7 +910,7 @@
           <w:sz w:val="18"/>
           <w:szCs w:val="18"/>
         </w:rPr>
-        <w:t xml:space="preserve">React · Express.js · MongoDB · Tailwind CSS</w:t>
+        <w:t xml:space="preserve">React · TypeScript · Express.js · Supabase</w:t>
       </w:r>
     </w:p>
     <w:p>
@@ -815,17 +920,17 @@
           <w:ilvl w:val="0"/>
           <w:numId w:val="1"/>
         </w:numPr>
-        <w:spacing w:after="30" w:before="0" w:line="240" w:lineRule="auto"/>
+        <w:spacing w:after="36" w:before="0" w:line="252" w:lineRule="auto"/>
         <w:ind w:left="360" w:hanging="180"/>
       </w:pPr>
       <w:r>
         <w:rPr>
           <w:rFonts w:ascii="Calibri" w:cs="Calibri" w:eastAsia="Calibri" w:hAnsi="Calibri"/>
-          <w:color w:val="0F1A14"/>
-          <w:sz w:val="20"/>
-          <w:szCs w:val="20"/>
-        </w:rPr>
-        <w:t xml:space="preserve">Full-stack exam platform for SSC/HSC students with server-authoritative grading and timer — answers are never sent to the client before submission, removing any cheating vector.</w:t>
+          <w:color w:val="1F2937"/>
+          <w:sz w:val="20"/>
+          <w:szCs w:val="20"/>
+        </w:rPr>
+        <w:t xml:space="preserve">Scenario-based assessment measuring communication style across four archetypes; a weighted scoring algorithm calculates primary, secondary, and blend profiles from 32 questions.</w:t>
       </w:r>
     </w:p>
     <w:p>
@@ -835,217 +940,17 @@
           <w:ilvl w:val="0"/>
           <w:numId w:val="1"/>
         </w:numPr>
-        <w:spacing w:after="30" w:before="0" w:line="240" w:lineRule="auto"/>
+        <w:spacing w:after="36" w:before="0" w:line="252" w:lineRule="auto"/>
         <w:ind w:left="360" w:hanging="180"/>
       </w:pPr>
       <w:r>
         <w:rPr>
           <w:rFonts w:ascii="Calibri" w:cs="Calibri" w:eastAsia="Calibri" w:hAnsi="Calibri"/>
-          <w:color w:val="0F1A14"/>
-          <w:sz w:val="20"/>
-          <w:szCs w:val="20"/>
-        </w:rPr>
-        <w:t xml:space="preserve">Built admin dashboard with JSON exam importer and CSV export, plus per-exam leaderboards and per-student score history.</w:t>
-      </w:r>
-    </w:p>
-    <w:p>
-      <w:pPr>
-        <w:pStyle w:val="ListParagraph"/>
-        <w:numPr>
-          <w:ilvl w:val="0"/>
-          <w:numId w:val="1"/>
-        </w:numPr>
-        <w:spacing w:after="30" w:before="0" w:line="240" w:lineRule="auto"/>
-        <w:ind w:left="360" w:hanging="180"/>
-      </w:pPr>
-      <w:r>
-        <w:rPr>
-          <w:rFonts w:ascii="Calibri" w:cs="Calibri" w:eastAsia="Calibri" w:hAnsi="Calibri"/>
-          <w:color w:val="0F1A14"/>
-          <w:sz w:val="20"/>
-          <w:szCs w:val="20"/>
-        </w:rPr>
-        <w:t xml:space="preserve">Designed the server-side timer to stay accurate across tab throttling and varying network conditions.</w:t>
-      </w:r>
-    </w:p>
-    <w:p>
-      <w:pPr>
-        <w:spacing w:after="0" w:before="60"/>
-      </w:pPr>
-    </w:p>
-    <w:p>
-      <w:pPr>
-        <w:tabs>
-          <w:tab w:val="right" w:pos="9026"/>
-        </w:tabs>
-        <w:spacing w:after="20" w:before="100"/>
-      </w:pPr>
-      <w:r>
-        <w:rPr>
-          <w:rFonts w:ascii="Calibri" w:cs="Calibri" w:eastAsia="Calibri" w:hAnsi="Calibri"/>
-          <w:b/>
-          <w:bCs/>
-          <w:color w:val="0F1A14"/>
-          <w:sz w:val="20"/>
-          <w:szCs w:val="20"/>
-        </w:rPr>
-        <w:t xml:space="preserve">SelfMatrix — AI Personality Assessment</w:t>
-      </w:r>
-      <w:r>
-        <w:rPr>
-          <w:rFonts w:ascii="Calibri" w:cs="Calibri" w:eastAsia="Calibri" w:hAnsi="Calibri"/>
-          <w:color w:val="6B7280"/>
-          <w:sz w:val="20"/>
-          <w:szCs w:val="20"/>
-        </w:rPr>
-        <w:t xml:space="preserve">  —  </w:t>
-      </w:r>
-      <w:r>
-        <w:rPr>
-          <w:rFonts w:ascii="Calibri" w:cs="Calibri" w:eastAsia="Calibri" w:hAnsi="Calibri"/>
-          <w:color w:val="1A6647"/>
-          <w:sz w:val="20"/>
-          <w:szCs w:val="20"/>
-        </w:rPr>
-        <w:t xml:space="preserve">selfmatrix.vercel.app</w:t>
-      </w:r>
-      <w:r>
-        <w:rPr>
-          <w:sz w:val="20"/>
-          <w:szCs w:val="20"/>
-        </w:rPr>
-        <w:t xml:space="preserve">	</w:t>
-      </w:r>
-      <w:r>
-        <w:rPr>
-          <w:rFonts w:ascii="Calibri" w:cs="Calibri" w:eastAsia="Calibri" w:hAnsi="Calibri"/>
-          <w:i/>
-          <w:iCs/>
-          <w:color w:val="6B7280"/>
-          <w:sz w:val="18"/>
-          <w:szCs w:val="18"/>
-        </w:rPr>
-        <w:t xml:space="preserve">React · TypeScript · Express.js · Supabase</w:t>
-      </w:r>
-    </w:p>
-    <w:p>
-      <w:pPr>
-        <w:pStyle w:val="ListParagraph"/>
-        <w:numPr>
-          <w:ilvl w:val="0"/>
-          <w:numId w:val="1"/>
-        </w:numPr>
-        <w:spacing w:after="30" w:before="0" w:line="240" w:lineRule="auto"/>
-        <w:ind w:left="360" w:hanging="180"/>
-      </w:pPr>
-      <w:r>
-        <w:rPr>
-          <w:rFonts w:ascii="Calibri" w:cs="Calibri" w:eastAsia="Calibri" w:hAnsi="Calibri"/>
-          <w:color w:val="0F1A14"/>
-          <w:sz w:val="20"/>
-          <w:szCs w:val="20"/>
-        </w:rPr>
-        <w:t xml:space="preserve">Scenario-based communication personality tool: 32 questions measuring four archetypes, with weighted scoring that calculates primary, secondary, and blend profiles.</w:t>
-      </w:r>
-    </w:p>
-    <w:p>
-      <w:pPr>
-        <w:pStyle w:val="ListParagraph"/>
-        <w:numPr>
-          <w:ilvl w:val="0"/>
-          <w:numId w:val="1"/>
-        </w:numPr>
-        <w:spacing w:after="30" w:before="0" w:line="240" w:lineRule="auto"/>
-        <w:ind w:left="360" w:hanging="180"/>
-      </w:pPr>
-      <w:r>
-        <w:rPr>
-          <w:rFonts w:ascii="Calibri" w:cs="Calibri" w:eastAsia="Calibri" w:hAnsi="Calibri"/>
-          <w:color w:val="0F1A14"/>
-          <w:sz w:val="20"/>
-          <w:szCs w:val="20"/>
-        </w:rPr>
-        <w:t xml:space="preserve">Integrated LLM-powered personalized growth plans and shareable result URLs with encoded state — no login required.</w:t>
-      </w:r>
-    </w:p>
-    <w:p>
-      <w:pPr>
-        <w:spacing w:after="0" w:before="60"/>
-      </w:pPr>
-    </w:p>
-    <w:p>
-      <w:pPr>
-        <w:tabs>
-          <w:tab w:val="right" w:pos="9026"/>
-        </w:tabs>
-        <w:spacing w:after="20" w:before="100"/>
-      </w:pPr>
-      <w:r>
-        <w:rPr>
-          <w:rFonts w:ascii="Calibri" w:cs="Calibri" w:eastAsia="Calibri" w:hAnsi="Calibri"/>
-          <w:b/>
-          <w:bCs/>
-          <w:color w:val="0F1A14"/>
-          <w:sz w:val="20"/>
-          <w:szCs w:val="20"/>
-        </w:rPr>
-        <w:t xml:space="preserve">Outfitro — Fashion E-Commerce</w:t>
-      </w:r>
-      <w:r>
-        <w:rPr>
-          <w:rFonts w:ascii="Calibri" w:cs="Calibri" w:eastAsia="Calibri" w:hAnsi="Calibri"/>
-          <w:color w:val="6B7280"/>
-          <w:sz w:val="20"/>
-          <w:szCs w:val="20"/>
-        </w:rPr>
-        <w:t xml:space="preserve">  —  </w:t>
-      </w:r>
-      <w:r>
-        <w:rPr>
-          <w:rFonts w:ascii="Calibri" w:cs="Calibri" w:eastAsia="Calibri" w:hAnsi="Calibri"/>
-          <w:color w:val="1A6647"/>
-          <w:sz w:val="20"/>
-          <w:szCs w:val="20"/>
-        </w:rPr>
-        <w:t xml:space="preserve">outfitro.com</w:t>
-      </w:r>
-      <w:r>
-        <w:rPr>
-          <w:sz w:val="20"/>
-          <w:szCs w:val="20"/>
-        </w:rPr>
-        <w:t xml:space="preserve">	</w:t>
-      </w:r>
-      <w:r>
-        <w:rPr>
-          <w:rFonts w:ascii="Calibri" w:cs="Calibri" w:eastAsia="Calibri" w:hAnsi="Calibri"/>
-          <w:i/>
-          <w:iCs/>
-          <w:color w:val="6B7280"/>
-          <w:sz w:val="18"/>
-          <w:szCs w:val="18"/>
-        </w:rPr>
-        <w:t xml:space="preserve">React · Express.js · Node.js · cPanel</w:t>
-      </w:r>
-    </w:p>
-    <w:p>
-      <w:pPr>
-        <w:pStyle w:val="ListParagraph"/>
-        <w:numPr>
-          <w:ilvl w:val="0"/>
-          <w:numId w:val="1"/>
-        </w:numPr>
-        <w:spacing w:after="30" w:before="0" w:line="240" w:lineRule="auto"/>
-        <w:ind w:left="360" w:hanging="180"/>
-      </w:pPr>
-      <w:r>
-        <w:rPr>
-          <w:rFonts w:ascii="Calibri" w:cs="Calibri" w:eastAsia="Calibri" w:hAnsi="Calibri"/>
-          <w:color w:val="0F1A14"/>
-          <w:sz w:val="20"/>
-          <w:szCs w:val="20"/>
-        </w:rPr>
-        <w:t xml:space="preserve">Full-stack fashion storefront with product catalog, authentication, cart-to-checkout flow, and cPanel deployment — built as part of a 3-person paid client team.</w:t>
+          <w:color w:val="1F2937"/>
+          <w:sz w:val="20"/>
+          <w:szCs w:val="20"/>
+        </w:rPr>
+        <w:t xml:space="preserve">Results include AI-generated personalized guidance and are shareable via encoded URL without requiring user registration.</w:t>
       </w:r>
     </w:p>
     <w:p>
@@ -1053,12 +958,12 @@
         <w:pBdr>
           <w:top w:val="single" w:color="1A6647" w:sz="6" w:space="0"/>
         </w:pBdr>
-        <w:spacing w:after="0" w:before="0"/>
-      </w:pPr>
-    </w:p>
-    <w:p>
-      <w:pPr>
-        <w:spacing w:after="60" w:before="240"/>
+        <w:spacing w:after="0" w:before="220"/>
+      </w:pPr>
+    </w:p>
+    <w:p>
+      <w:pPr>
+        <w:spacing w:after="80" w:before="40"/>
       </w:pPr>
       <w:r>
         <w:rPr>
@@ -1085,20 +990,17 @@
           <w:rFonts w:ascii="Calibri" w:cs="Calibri" w:eastAsia="Calibri" w:hAnsi="Calibri"/>
           <w:b/>
           <w:bCs/>
-          <w:color w:val="0F1A14"/>
+          <w:color w:val="1F2937"/>
+          <w:sz w:val="23"/>
+          <w:szCs w:val="23"/>
+        </w:rPr>
+        <w:t xml:space="preserve">M.Sc. Engineering — Information &amp; Communication Technology</w:t>
+      </w:r>
+      <w:r>
+        <w:rPr>
           <w:sz w:val="22"/>
           <w:szCs w:val="22"/>
         </w:rPr>
-        <w:t xml:space="preserve">M.Sc. Engineering — Information &amp; Communication Technology</w:t>
-      </w:r>
-      <w:r>
-        <w:t xml:space="preserve"/>
-      </w:r>
-      <w:r>
-        <w:rPr>
-          <w:sz w:val="22"/>
-          <w:szCs w:val="22"/>
-        </w:rPr>
         <w:t xml:space="preserve">	</w:t>
       </w:r>
       <w:r>
@@ -1106,23 +1008,21 @@
           <w:rFonts w:ascii="Calibri" w:cs="Calibri" w:eastAsia="Calibri" w:hAnsi="Calibri"/>
           <w:i/>
           <w:iCs/>
-          <w:color w:val="6B7280"/>
-          <w:sz w:val="22"/>
-          <w:szCs w:val="22"/>
+          <w:color w:val="4B5563"/>
+          <w:sz w:val="20"/>
+          <w:szCs w:val="20"/>
         </w:rPr>
         <w:t xml:space="preserve">2025 — Present</w:t>
       </w:r>
     </w:p>
     <w:p>
       <w:pPr>
-        <w:spacing w:after="40" w:before="0"/>
-      </w:pPr>
-      <w:r>
-        <w:rPr>
-          <w:rFonts w:ascii="Calibri" w:cs="Calibri" w:eastAsia="Calibri" w:hAnsi="Calibri"/>
-          <w:i w:val="false"/>
-          <w:iCs w:val="false"/>
-          <w:color w:val="374151"/>
+        <w:spacing w:after="60" w:before="0"/>
+      </w:pPr>
+      <w:r>
+        <w:rPr>
+          <w:rFonts w:ascii="Calibri" w:cs="Calibri" w:eastAsia="Calibri" w:hAnsi="Calibri"/>
+          <w:color w:val="4B5563"/>
           <w:sz w:val="20"/>
           <w:szCs w:val="20"/>
         </w:rPr>
@@ -1140,16 +1040,16 @@
           <w:bCs w:val="false"/>
           <w:i w:val="false"/>
           <w:iCs w:val="false"/>
-          <w:color w:val="374151"/>
-          <w:sz w:val="20"/>
-          <w:szCs w:val="20"/>
-        </w:rPr>
-        <w:t xml:space="preserve">Research focus: deep learning for medical imaging, computer vision, and network intrusion detection.</w:t>
-      </w:r>
-    </w:p>
-    <w:p>
-      <w:pPr>
-        <w:spacing w:after="0" w:before="60"/>
+          <w:color w:val="4B5563"/>
+          <w:sz w:val="20"/>
+          <w:szCs w:val="20"/>
+        </w:rPr>
+        <w:t xml:space="preserve">Research focus: applied deep learning for medical imaging, computer vision, and network intrusion detection.</w:t>
+      </w:r>
+    </w:p>
+    <w:p>
+      <w:pPr>
+        <w:spacing w:after="60" w:before="0"/>
       </w:pPr>
     </w:p>
     <w:p>
@@ -1164,20 +1064,17 @@
           <w:rFonts w:ascii="Calibri" w:cs="Calibri" w:eastAsia="Calibri" w:hAnsi="Calibri"/>
           <w:b/>
           <w:bCs/>
-          <w:color w:val="0F1A14"/>
+          <w:color w:val="1F2937"/>
+          <w:sz w:val="23"/>
+          <w:szCs w:val="23"/>
+        </w:rPr>
+        <w:t xml:space="preserve">B.Sc. Engineering — Information &amp; Communication Technology</w:t>
+      </w:r>
+      <w:r>
+        <w:rPr>
           <w:sz w:val="22"/>
           <w:szCs w:val="22"/>
         </w:rPr>
-        <w:t xml:space="preserve">B.Sc. Engineering — Information &amp; Communication Technology</w:t>
-      </w:r>
-      <w:r>
-        <w:t xml:space="preserve"/>
-      </w:r>
-      <w:r>
-        <w:rPr>
-          <w:sz w:val="22"/>
-          <w:szCs w:val="22"/>
-        </w:rPr>
         <w:t xml:space="preserve">	</w:t>
       </w:r>
       <w:r>
@@ -1185,23 +1082,21 @@
           <w:rFonts w:ascii="Calibri" w:cs="Calibri" w:eastAsia="Calibri" w:hAnsi="Calibri"/>
           <w:i/>
           <w:iCs/>
-          <w:color w:val="6B7280"/>
-          <w:sz w:val="22"/>
-          <w:szCs w:val="22"/>
+          <w:color w:val="4B5563"/>
+          <w:sz w:val="20"/>
+          <w:szCs w:val="20"/>
         </w:rPr>
         <w:t xml:space="preserve">2020 — 2025</w:t>
       </w:r>
     </w:p>
     <w:p>
       <w:pPr>
-        <w:spacing w:after="40" w:before="0"/>
-      </w:pPr>
-      <w:r>
-        <w:rPr>
-          <w:rFonts w:ascii="Calibri" w:cs="Calibri" w:eastAsia="Calibri" w:hAnsi="Calibri"/>
-          <w:i w:val="false"/>
-          <w:iCs w:val="false"/>
-          <w:color w:val="374151"/>
+        <w:spacing w:after="60" w:before="0"/>
+      </w:pPr>
+      <w:r>
+        <w:rPr>
+          <w:rFonts w:ascii="Calibri" w:cs="Calibri" w:eastAsia="Calibri" w:hAnsi="Calibri"/>
+          <w:color w:val="4B5563"/>
           <w:sz w:val="20"/>
           <w:szCs w:val="20"/>
         </w:rPr>
@@ -1219,11 +1114,11 @@
           <w:bCs w:val="false"/>
           <w:i w:val="false"/>
           <w:iCs w:val="false"/>
-          <w:color w:val="374151"/>
-          <w:sz w:val="20"/>
-          <w:szCs w:val="20"/>
-        </w:rPr>
-        <w:t xml:space="preserve">Core coursework: software engineering, data structures, algorithms, computer networks, databases.</w:t>
+          <w:color w:val="4B5563"/>
+          <w:sz w:val="20"/>
+          <w:szCs w:val="20"/>
+        </w:rPr>
+        <w:t xml:space="preserve">Coursework: software engineering, data structures, algorithms, computer networks, databases.</w:t>
       </w:r>
     </w:p>
     <w:p>
@@ -1231,12 +1126,12 @@
         <w:pBdr>
           <w:top w:val="single" w:color="1A6647" w:sz="6" w:space="0"/>
         </w:pBdr>
-        <w:spacing w:after="0" w:before="0"/>
-      </w:pPr>
-    </w:p>
-    <w:p>
-      <w:pPr>
-        <w:spacing w:after="60" w:before="240"/>
+        <w:spacing w:after="0" w:before="220"/>
+      </w:pPr>
+    </w:p>
+    <w:p>
+      <w:pPr>
+        <w:spacing w:after="80" w:before="40"/>
       </w:pPr>
       <w:r>
         <w:rPr>
@@ -1248,34 +1143,106 @@
           <w:sz w:val="20"/>
           <w:szCs w:val="20"/>
         </w:rPr>
-        <w:t xml:space="preserve">SELECTED PUBLICATIONS  (3 PEER-REVIEWED, 2025)</w:t>
-      </w:r>
-    </w:p>
-    <w:p>
-      <w:pPr>
-        <w:spacing w:after="20" w:before="40"/>
-      </w:pPr>
-      <w:r>
-        <w:rPr>
-          <w:rFonts w:ascii="Calibri" w:cs="Calibri" w:eastAsia="Calibri" w:hAnsi="Calibri"/>
-          <w:b/>
-          <w:bCs/>
-          <w:color w:val="0F1A14"/>
-          <w:sz w:val="20"/>
-          <w:szCs w:val="20"/>
-        </w:rPr>
-        <w:t xml:space="preserve">1. </w:t>
-      </w:r>
+        <w:t xml:space="preserve">RESEARCH PUBLICATIONS  (CO-AUTHOR, ALL 2025)</w:t>
+      </w:r>
+    </w:p>
+    <w:p>
+      <w:pPr>
+        <w:spacing w:after="20" w:before="40" w:line="252" w:lineRule="auto"/>
+        <w:ind w:left="280" w:hanging="180"/>
+      </w:pPr>
+      <w:r>
+        <w:rPr>
+          <w:rFonts w:ascii="Calibri" w:cs="Calibri" w:eastAsia="Calibri" w:hAnsi="Calibri"/>
+          <w:b/>
+          <w:bCs/>
+          <w:color w:val="1F2937"/>
+          <w:sz w:val="20"/>
+          <w:szCs w:val="20"/>
+        </w:rPr>
+        <w:t xml:space="preserve">1.  </w:t>
+      </w:r>
+      <w:r>
+        <w:rPr>
+          <w:rFonts w:ascii="Calibri" w:cs="Calibri" w:eastAsia="Calibri" w:hAnsi="Calibri"/>
+          <w:color w:val="1F2937"/>
+          <w:sz w:val="20"/>
+          <w:szCs w:val="20"/>
+        </w:rPr>
+        <w:t xml:space="preserve">Detection and Classification of Kidney Disease from CT Images: An Automated Deep Learning Approach</w:t>
+      </w:r>
+      <w:r>
+        <w:rPr>
+          <w:rFonts w:ascii="Calibri" w:cs="Calibri" w:eastAsia="Calibri" w:hAnsi="Calibri"/>
+          <w:color w:val="6B7280"/>
+          <w:sz w:val="20"/>
+          <w:szCs w:val="20"/>
+        </w:rPr>
+        <w:t xml:space="preserve">  —  </w:t>
+      </w:r>
+      <w:r>
+        <w:rPr>
+          <w:rFonts w:ascii="Calibri" w:cs="Calibri" w:eastAsia="Calibri" w:hAnsi="Calibri"/>
+          <w:i/>
+          <w:iCs/>
+          <w:color w:val="4B5563"/>
+          <w:sz w:val="20"/>
+          <w:szCs w:val="20"/>
+        </w:rPr>
+        <w:t xml:space="preserve">MDPI Technologies, Vol. 13, No. 11</w:t>
+      </w:r>
+      <w:r>
+        <w:rPr>
+          <w:rFonts w:ascii="Calibri" w:cs="Calibri" w:eastAsia="Calibri" w:hAnsi="Calibri"/>
+          <w:color w:val="6B7280"/>
+          <w:sz w:val="18"/>
+          <w:szCs w:val="18"/>
+        </w:rPr>
+        <w:t xml:space="preserve">  ·  DOI: 10.3390/technologies13110508</w:t>
+      </w:r>
+    </w:p>
+    <w:p>
+      <w:pPr>
+        <w:spacing w:after="20" w:before="0"/>
+      </w:pPr>
       <w:r>
         <w:rPr>
           <w:rFonts w:ascii="Calibri" w:cs="Calibri" w:eastAsia="Calibri" w:hAnsi="Calibri"/>
           <w:b w:val="false"/>
           <w:bCs w:val="false"/>
-          <w:color w:val="0F1A14"/>
-          <w:sz w:val="20"/>
-          <w:szCs w:val="20"/>
-        </w:rPr>
-        <w:t xml:space="preserve">Detection and Classification of Kidney Disease from CT Images: An Automated Deep Learning Approach</w:t>
+          <w:i w:val="false"/>
+          <w:iCs w:val="false"/>
+          <w:color w:val="4B5563"/>
+          <w:sz w:val="19"/>
+          <w:szCs w:val="19"/>
+        </w:rPr>
+        <w:t xml:space="preserve">DenseNet121/EfficientNetB0 soft-voting ensemble for CT-based renal classification. 99.24% accuracy reported on benchmark dataset.</w:t>
+      </w:r>
+    </w:p>
+    <w:p>
+      <w:pPr>
+        <w:spacing w:after="20" w:before="40" w:line="252" w:lineRule="auto"/>
+        <w:ind w:left="280" w:hanging="180"/>
+      </w:pPr>
+      <w:r>
+        <w:rPr>
+          <w:rFonts w:ascii="Calibri" w:cs="Calibri" w:eastAsia="Calibri" w:hAnsi="Calibri"/>
+          <w:b/>
+          <w:bCs/>
+          <w:color w:val="1F2937"/>
+          <w:sz w:val="20"/>
+          <w:szCs w:val="20"/>
+        </w:rPr>
+        <w:t xml:space="preserve">2.  </w:t>
+      </w:r>
+      <w:r>
+        <w:rPr>
+          <w:rFonts w:ascii="Calibri" w:cs="Calibri" w:eastAsia="Calibri" w:hAnsi="Calibri"/>
+          <w:color w:val="1F2937"/>
+          <w:sz w:val="20"/>
+          <w:szCs w:val="20"/>
+        </w:rPr>
+        <w:t xml:space="preserve">An IoT-Based Lung Cancer Detection System from CT Images Using Deep Learning</w:t>
       </w:r>
       <w:r>
         <w:rPr>
@@ -1291,38 +1258,64 @@
           <w:rFonts w:ascii="Calibri" w:cs="Calibri" w:eastAsia="Calibri" w:hAnsi="Calibri"/>
           <w:i/>
           <w:iCs/>
-          <w:color w:val="374151"/>
-          <w:sz w:val="20"/>
-          <w:szCs w:val="20"/>
-        </w:rPr>
-        <w:t xml:space="preserve">MDPI Technologies, Vol. 13, No. 11 (2025). DOI: 10.3390/technologies13110508</w:t>
-      </w:r>
-    </w:p>
-    <w:p>
-      <w:pPr>
-        <w:spacing w:after="20" w:before="20"/>
-      </w:pPr>
-      <w:r>
-        <w:rPr>
-          <w:rFonts w:ascii="Calibri" w:cs="Calibri" w:eastAsia="Calibri" w:hAnsi="Calibri"/>
-          <w:b/>
-          <w:bCs/>
-          <w:color w:val="0F1A14"/>
-          <w:sz w:val="20"/>
-          <w:szCs w:val="20"/>
-        </w:rPr>
-        <w:t xml:space="preserve">2. </w:t>
-      </w:r>
+          <w:color w:val="4B5563"/>
+          <w:sz w:val="20"/>
+          <w:szCs w:val="20"/>
+        </w:rPr>
+        <w:t xml:space="preserve">Springer Nature · ITSS-IoE 2025, Univ. of Wolverhampton, UK</w:t>
+      </w:r>
+      <w:r>
+        <w:rPr>
+          <w:rFonts w:ascii="Calibri" w:cs="Calibri" w:eastAsia="Calibri" w:hAnsi="Calibri"/>
+          <w:color w:val="6B7280"/>
+          <w:sz w:val="18"/>
+          <w:szCs w:val="18"/>
+        </w:rPr>
+        <w:t xml:space="preserve">  ·  DOI: 10.1007/978-981-92-3681-7_14</w:t>
+      </w:r>
+    </w:p>
+    <w:p>
+      <w:pPr>
+        <w:spacing w:after="20" w:before="0"/>
+      </w:pPr>
       <w:r>
         <w:rPr>
           <w:rFonts w:ascii="Calibri" w:cs="Calibri" w:eastAsia="Calibri" w:hAnsi="Calibri"/>
           <w:b w:val="false"/>
           <w:bCs w:val="false"/>
-          <w:color w:val="0F1A14"/>
-          <w:sz w:val="20"/>
-          <w:szCs w:val="20"/>
-        </w:rPr>
-        <w:t xml:space="preserve">An IoT-Based Lung Cancer Detection System from CT Images Using Deep Learning</w:t>
+          <w:i w:val="false"/>
+          <w:iCs w:val="false"/>
+          <w:color w:val="4B5563"/>
+          <w:sz w:val="19"/>
+          <w:szCs w:val="19"/>
+        </w:rPr>
+        <w:t xml:space="preserve">Hybrid ResNet152V2/InceptionV3 with a channel-spatial attention module for lung CT classification. 98% accuracy reported.</w:t>
+      </w:r>
+    </w:p>
+    <w:p>
+      <w:pPr>
+        <w:spacing w:after="20" w:before="40" w:line="252" w:lineRule="auto"/>
+        <w:ind w:left="280" w:hanging="180"/>
+      </w:pPr>
+      <w:r>
+        <w:rPr>
+          <w:rFonts w:ascii="Calibri" w:cs="Calibri" w:eastAsia="Calibri" w:hAnsi="Calibri"/>
+          <w:b/>
+          <w:bCs/>
+          <w:color w:val="1F2937"/>
+          <w:sz w:val="20"/>
+          <w:szCs w:val="20"/>
+        </w:rPr>
+        <w:t xml:space="preserve">3.  </w:t>
+      </w:r>
+      <w:r>
+        <w:rPr>
+          <w:rFonts w:ascii="Calibri" w:cs="Calibri" w:eastAsia="Calibri" w:hAnsi="Calibri"/>
+          <w:color w:val="1F2937"/>
+          <w:sz w:val="20"/>
+          <w:szCs w:val="20"/>
+        </w:rPr>
+        <w:t xml:space="preserve">Classification of Kidney Disease from CT Images: A Deep Learning-Based Comparative Analysis</w:t>
       </w:r>
       <w:r>
         <w:rPr>
@@ -1338,63 +1331,43 @@
           <w:rFonts w:ascii="Calibri" w:cs="Calibri" w:eastAsia="Calibri" w:hAnsi="Calibri"/>
           <w:i/>
           <w:iCs/>
-          <w:color w:val="374151"/>
-          <w:sz w:val="20"/>
-          <w:szCs w:val="20"/>
-        </w:rPr>
-        <w:t xml:space="preserve">Springer Nature, ITSS-IoE 2025, Univ. of Wolverhampton, UK. DOI: 10.1007/978-981-92-3681-7_14</w:t>
-      </w:r>
-    </w:p>
-    <w:p>
-      <w:pPr>
-        <w:spacing w:after="40" w:before="20"/>
-      </w:pPr>
-      <w:r>
-        <w:rPr>
-          <w:rFonts w:ascii="Calibri" w:cs="Calibri" w:eastAsia="Calibri" w:hAnsi="Calibri"/>
-          <w:b/>
-          <w:bCs/>
-          <w:color w:val="0F1A14"/>
-          <w:sz w:val="20"/>
-          <w:szCs w:val="20"/>
-        </w:rPr>
-        <w:t xml:space="preserve">3. </w:t>
-      </w:r>
+          <w:color w:val="4B5563"/>
+          <w:sz w:val="20"/>
+          <w:szCs w:val="20"/>
+        </w:rPr>
+        <w:t xml:space="preserve">IEEE ICSECS 2025, Malaysia</w:t>
+      </w:r>
+      <w:r>
+        <w:rPr>
+          <w:rFonts w:ascii="Calibri" w:cs="Calibri" w:eastAsia="Calibri" w:hAnsi="Calibri"/>
+          <w:color w:val="6B7280"/>
+          <w:sz w:val="18"/>
+          <w:szCs w:val="18"/>
+        </w:rPr>
+        <w:t xml:space="preserve">  ·  DOI: 10.1109/ICSECS65227.2025.11279151</w:t>
+      </w:r>
+    </w:p>
+    <w:p>
+      <w:pPr>
+        <w:spacing w:after="40" w:before="0"/>
+      </w:pPr>
       <w:r>
         <w:rPr>
           <w:rFonts w:ascii="Calibri" w:cs="Calibri" w:eastAsia="Calibri" w:hAnsi="Calibri"/>
           <w:b w:val="false"/>
           <w:bCs w:val="false"/>
-          <w:color w:val="0F1A14"/>
-          <w:sz w:val="20"/>
-          <w:szCs w:val="20"/>
-        </w:rPr>
-        <w:t xml:space="preserve">Classification of Kidney Disease from CT Images: A Deep Learning-Based Comparative Analysis</w:t>
-      </w:r>
-      <w:r>
-        <w:rPr>
-          <w:rFonts w:ascii="Calibri" w:cs="Calibri" w:eastAsia="Calibri" w:hAnsi="Calibri"/>
-          <w:color w:val="6B7280"/>
-          <w:sz w:val="20"/>
-          <w:szCs w:val="20"/>
-        </w:rPr>
-        <w:t xml:space="preserve">  —  </w:t>
-      </w:r>
-      <w:r>
-        <w:rPr>
-          <w:rFonts w:ascii="Calibri" w:cs="Calibri" w:eastAsia="Calibri" w:hAnsi="Calibri"/>
-          <w:i/>
-          <w:iCs/>
-          <w:color w:val="374151"/>
-          <w:sz w:val="20"/>
-          <w:szCs w:val="20"/>
-        </w:rPr>
-        <w:t xml:space="preserve">IEEE ICSECS 2025, Malaysia. DOI: 10.1109/ICSECS65227.2025.11279151</w:t>
+          <w:i w:val="false"/>
+          <w:iCs w:val="false"/>
+          <w:color w:val="4B5563"/>
+          <w:sz w:val="19"/>
+          <w:szCs w:val="19"/>
+        </w:rPr>
+        <w:t xml:space="preserve">Ensemble DenseNet121/EfficientNetB0 with explainable AI on 12,447 CT images. 98.98% accuracy and 98.60% F1-score reported.</w:t>
       </w:r>
     </w:p>
     <w:sectPr>
       <w:pgSz w:w="11906" w:h="16838" w:orient="portrait"/>
-      <w:pgMar w:top="792" w:right="936" w:bottom="792" w:left="936" w:header="708" w:footer="708" w:gutter="0"/>
+      <w:pgMar w:top="748" w:right="892" w:bottom="748" w:left="892" w:header="708" w:footer="708" w:gutter="0"/>
       <w:pgNumType/>
       <w:docGrid w:linePitch="360"/>
     </w:sectPr>
@@ -1577,14 +1550,14 @@
     <w:rPrDefault>
       <w:rPr>
         <w:rFonts w:ascii="Calibri" w:cs="Calibri" w:eastAsia="Calibri" w:hAnsi="Calibri"/>
-        <w:color w:val="0F1A14"/>
+        <w:color w:val="1F2937"/>
         <w:sz w:val="20"/>
         <w:szCs w:val="20"/>
       </w:rPr>
     </w:rPrDefault>
     <w:pPrDefault>
       <w:pPr>
-        <w:spacing w:line="240" w:lineRule="auto"/>
+        <w:spacing w:line="252" w:lineRule="auto"/>
       </w:pPr>
     </w:pPrDefault>
   </w:docDefaults>

</xml_diff>

<commit_message>
docs(resume): fix freelance date to 2024, sharpen SelfMatrix LLM bullet, confirm Angular Material/SCSS
</commit_message>
<xml_diff>
--- a/public/Tanvir_Ahmmed_Sifat_Resume.docx
+++ b/public/Tanvir_Ahmmed_Sifat_Resume.docx
@@ -128,7 +128,7 @@
           <w:sz w:val="20"/>
           <w:szCs w:val="20"/>
         </w:rPr>
-        <w:t xml:space="preserve">Web developer with over two years building and maintaining production web applications using Angular, React, and Next.js. At UTRDL, implements frontend features and integrates APIs for client portals across finance, real estate, and venture capital. Has contributed to three paid client e-commerce platforms as part of collaborative teams. Completing an M.Sc. in ICT, with three peer-reviewed publications in applied deep learning.</w:t>
+        <w:t xml:space="preserve">Web developer with over two years building and maintaining production web applications using Angular, React, and Next.js. At UTRDL, implements frontend features and integrates APIs for client portals across finance, real estate, and venture capital. Has contributed to paid client platforms as part of collaborative development teams. Currently completing an M.Sc. in ICT, with three peer-reviewed publications in applied deep learning.</w:t>
       </w:r>
     </w:p>
     <w:p>
@@ -253,7 +253,7 @@
           <w:sz w:val="20"/>
           <w:szCs w:val="20"/>
         </w:rPr>
-        <w:t xml:space="preserve">Git, GitHub, IIS Server, Vercel, Azure VPS, cPanel, VPS, Postman, Figma, Google Analytics</w:t>
+        <w:t xml:space="preserve">Git, GitHub, IIS Server, Vercel, Azure VPS, cPanel, Postman, Figma, Google Analytics</w:t>
       </w:r>
     </w:p>
     <w:p>
@@ -374,7 +374,7 @@
           <w:sz w:val="20"/>
           <w:szCs w:val="20"/>
         </w:rPr>
-        <w:t xml:space="preserve">Implemented frontend features and workflow updates in Angular and React/Next.js across client applications for UK and UAE businesses in mortgage finance, commercial real estate, and venture capital.</w:t>
+        <w:t xml:space="preserve">Implemented frontend features and workflow updates in Angular and React/Next.js for UK and UAE client applications in mortgage finance, commercial real estate, and venture capital.</w:t>
       </w:r>
     </w:p>
     <w:p>
@@ -394,7 +394,7 @@
           <w:sz w:val="20"/>
           <w:szCs w:val="20"/>
         </w:rPr>
-        <w:t xml:space="preserve">Built and maintained client portals including a mortgage broker dashboard with loan calculation tools, multi-step application forms, and document upload; and a commercial real estate platform with map-based property search and location filtering.</w:t>
+        <w:t xml:space="preserve">Built and maintained client-facing portals including a mortgage broker dashboard with loan calculators, multi-step application forms, and document upload; and a commercial real estate platform with interactive map search and location filtering.</w:t>
       </w:r>
     </w:p>
     <w:p>
@@ -414,7 +414,7 @@
           <w:sz w:val="20"/>
           <w:szCs w:val="20"/>
         </w:rPr>
-        <w:t xml:space="preserve">Integrated REST APIs across application modules — handling data fetching, loading states, error handling, and coordinating API contract changes with the backend team as requirements evolved.</w:t>
+        <w:t xml:space="preserve">Integrated REST APIs across frontend modules — handling data fetching, loading and error states, and adapting to changing API contracts as business requirements evolved.</w:t>
       </w:r>
     </w:p>
     <w:p>
@@ -434,7 +434,7 @@
           <w:sz w:val="20"/>
           <w:szCs w:val="20"/>
         </w:rPr>
-        <w:t xml:space="preserve">Built reusable UI component libraries to maintain visual consistency across projects, and managed production builds and deployments to IIS Server.</w:t>
+        <w:t xml:space="preserve">Built shared Angular Material and custom component libraries to maintain UI consistency across projects; managed production IIS Server builds and deployments.</w:t>
       </w:r>
     </w:p>
     <w:p>
@@ -476,7 +476,7 @@
           <w:sz w:val="20"/>
           <w:szCs w:val="20"/>
         </w:rPr>
-        <w:t xml:space="preserve">2023 — Present</w:t>
+        <w:t xml:space="preserve">2024 — Present</w:t>
       </w:r>
     </w:p>
     <w:p>
@@ -510,7 +510,7 @@
           <w:sz w:val="20"/>
           <w:szCs w:val="20"/>
         </w:rPr>
-        <w:t xml:space="preserve">Contributed to three paid client e-commerce platforms in three-person development teams, working across Next.js and React frontends and Node.js/Express REST APIs.</w:t>
+        <w:t xml:space="preserve">Contributed to three paid client e-commerce platforms in three-person development teams, working across React and Next.js frontends and Node.js/Express REST APIs.</w:t>
       </w:r>
     </w:p>
     <w:p>
@@ -530,7 +530,7 @@
           <w:sz w:val="20"/>
           <w:szCs w:val="20"/>
         </w:rPr>
-        <w:t xml:space="preserve">Implemented authentication flows, product and order management, multi-vendor dashboards, and cart-to-checkout workflows; configured SEO metadata and Google Analytics for client storefronts.</w:t>
+        <w:t xml:space="preserve">Implemented authentication, product catalog, order management, multi-vendor dashboards, and cart-to-checkout flows; set up SEO metadata and Google Analytics for client storefronts.</w:t>
       </w:r>
     </w:p>
     <w:p>
@@ -650,7 +650,7 @@
           <w:sz w:val="20"/>
           <w:szCs w:val="20"/>
         </w:rPr>
-        <w:t xml:space="preserve">Production marketplace where independent sellers manage their own product listings and orders through separate seller, admin, and customer interfaces — each with role-specific views and permissions.</w:t>
+        <w:t xml:space="preserve">Production marketplace where independent sellers manage their own listings and orders; separate interfaces handle seller inventory, admin oversight, and customer purchasing, each with role-specific permissions.</w:t>
       </w:r>
     </w:p>
     <w:p>
@@ -670,7 +670,7 @@
           <w:sz w:val="20"/>
           <w:szCs w:val="20"/>
         </w:rPr>
-        <w:t xml:space="preserve">Contributed role-based dashboard views, integrated payment and order confirmation flows, implemented cross-vendor catalog search, wired SEO metadata and Google Analytics, and deployed to Azure VPS.</w:t>
+        <w:t xml:space="preserve">Contributed role-based dashboards, payment and order confirmation flows, cross-vendor catalog search, SEO and analytics setup, and Azure VPS deployment.</w:t>
       </w:r>
     </w:p>
     <w:p>
@@ -750,7 +750,7 @@
           <w:sz w:val="20"/>
           <w:szCs w:val="20"/>
         </w:rPr>
-        <w:t xml:space="preserve">Exam platform for students where question delivery, timing, and grading are controlled server-side — answer data is stripped before being sent to the client, so submissions cannot be pre-populated or inspected in the browser.</w:t>
+        <w:t xml:space="preserve">Exam platform for students where question delivery, time limits, and grading are enforced server-side — answer data is stripped before sending questions to the client, preventing any client-side exposure ahead of submission.</w:t>
       </w:r>
     </w:p>
     <w:p>
@@ -770,7 +770,7 @@
           <w:sz w:val="20"/>
           <w:szCs w:val="20"/>
         </w:rPr>
-        <w:t xml:space="preserve">Built an admin interface for JSON-based exam creation and CSV export; implemented per-student result storage and retrieval, attempt history, and per-exam leaderboards.</w:t>
+        <w:t xml:space="preserve">Built an admin interface for JSON-based exam creation and CSV export; implemented per-student result storage, attempt history, and per-exam leaderboards.</w:t>
       </w:r>
     </w:p>
     <w:p>
@@ -850,7 +850,7 @@
           <w:sz w:val="20"/>
           <w:szCs w:val="20"/>
         </w:rPr>
-        <w:t xml:space="preserve">Contributed to a full-stack fashion storefront as part of a three-person paid client team: built storefront pages and product views in React, developed REST endpoints on the Express API, and implemented authentication and the cart-to-checkout flow.</w:t>
+        <w:t xml:space="preserve">Contributed to a full-stack fashion storefront as part of a three-person client team: built product pages and storefront views in React, developed REST API endpoints, and implemented user authentication and cart-to-checkout flow.</w:t>
       </w:r>
     </w:p>
     <w:p>
@@ -930,7 +930,7 @@
           <w:sz w:val="20"/>
           <w:szCs w:val="20"/>
         </w:rPr>
-        <w:t xml:space="preserve">Scenario-based assessment measuring communication style across four archetypes; a weighted scoring algorithm calculates primary, secondary, and blend profiles from 32 questions.</w:t>
+        <w:t xml:space="preserve">Scenario-based tool that measures communication style across four archetypes using a weighted scoring algorithm; after the 32-question assessment, calls an LLM API to generate a plain-language explanation of the user's result profile.</w:t>
       </w:r>
     </w:p>
     <w:p>
@@ -950,7 +950,7 @@
           <w:sz w:val="20"/>
           <w:szCs w:val="20"/>
         </w:rPr>
-        <w:t xml:space="preserve">Results include AI-generated personalized guidance and are shareable via encoded URL without requiring user registration.</w:t>
+        <w:t xml:space="preserve">Results and archetype explanations are shareable via encoded URL without requiring user registration.</w:t>
       </w:r>
     </w:p>
     <w:p>
@@ -1031,20 +1031,18 @@
     </w:p>
     <w:p>
       <w:pPr>
-        <w:spacing w:after="40" w:before="0"/>
-      </w:pPr>
-      <w:r>
-        <w:rPr>
-          <w:rFonts w:ascii="Calibri" w:cs="Calibri" w:eastAsia="Calibri" w:hAnsi="Calibri"/>
-          <w:b w:val="false"/>
-          <w:bCs w:val="false"/>
+        <w:spacing w:after="0" w:before="0"/>
+      </w:pPr>
+      <w:r>
+        <w:rPr>
+          <w:rFonts w:ascii="Calibri" w:cs="Calibri" w:eastAsia="Calibri" w:hAnsi="Calibri"/>
           <w:i w:val="false"/>
           <w:iCs w:val="false"/>
           <w:color w:val="4B5563"/>
           <w:sz w:val="20"/>
           <w:szCs w:val="20"/>
         </w:rPr>
-        <w:t xml:space="preserve">Research focus: applied deep learning for medical imaging, computer vision, and network intrusion detection.</w:t>
+        <w:t xml:space="preserve">Research: applied deep learning for medical imaging, computer vision, and network intrusion detection.</w:t>
       </w:r>
     </w:p>
     <w:p>
@@ -1105,13 +1103,11 @@
     </w:p>
     <w:p>
       <w:pPr>
-        <w:spacing w:after="40" w:before="0"/>
-      </w:pPr>
-      <w:r>
-        <w:rPr>
-          <w:rFonts w:ascii="Calibri" w:cs="Calibri" w:eastAsia="Calibri" w:hAnsi="Calibri"/>
-          <w:b w:val="false"/>
-          <w:bCs w:val="false"/>
+        <w:spacing w:after="0" w:before="0"/>
+      </w:pPr>
+      <w:r>
+        <w:rPr>
+          <w:rFonts w:ascii="Calibri" w:cs="Calibri" w:eastAsia="Calibri" w:hAnsi="Calibri"/>
           <w:i w:val="false"/>
           <w:iCs w:val="false"/>
           <w:color w:val="4B5563"/>
@@ -1148,7 +1144,7 @@
     </w:p>
     <w:p>
       <w:pPr>
-        <w:spacing w:after="20" w:before="40" w:line="252" w:lineRule="auto"/>
+        <w:spacing w:after="0" w:before="40" w:line="252" w:lineRule="auto"/>
         <w:ind w:left="280" w:hanging="180"/>
       </w:pPr>
       <w:r>
@@ -1204,24 +1200,21 @@
     <w:p>
       <w:pPr>
         <w:spacing w:after="20" w:before="0"/>
-      </w:pPr>
-      <w:r>
-        <w:rPr>
-          <w:rFonts w:ascii="Calibri" w:cs="Calibri" w:eastAsia="Calibri" w:hAnsi="Calibri"/>
-          <w:b w:val="false"/>
-          <w:bCs w:val="false"/>
-          <w:i w:val="false"/>
-          <w:iCs w:val="false"/>
+        <w:ind w:left="280"/>
+      </w:pPr>
+      <w:r>
+        <w:rPr>
+          <w:rFonts w:ascii="Calibri" w:cs="Calibri" w:eastAsia="Calibri" w:hAnsi="Calibri"/>
           <w:color w:val="4B5563"/>
           <w:sz w:val="19"/>
           <w:szCs w:val="19"/>
         </w:rPr>
-        <w:t xml:space="preserve">DenseNet121/EfficientNetB0 soft-voting ensemble for CT-based renal classification. 99.24% accuracy reported on benchmark dataset.</w:t>
-      </w:r>
-    </w:p>
-    <w:p>
-      <w:pPr>
-        <w:spacing w:after="20" w:before="40" w:line="252" w:lineRule="auto"/>
+        <w:t xml:space="preserve">DenseNet121 / EfficientNetB0 soft-voting ensemble for CT-based renal classification. 99.24% accuracy reported.</w:t>
+      </w:r>
+    </w:p>
+    <w:p>
+      <w:pPr>
+        <w:spacing w:after="0" w:before="40" w:line="252" w:lineRule="auto"/>
         <w:ind w:left="280" w:hanging="180"/>
       </w:pPr>
       <w:r>
@@ -1277,24 +1270,21 @@
     <w:p>
       <w:pPr>
         <w:spacing w:after="20" w:before="0"/>
-      </w:pPr>
-      <w:r>
-        <w:rPr>
-          <w:rFonts w:ascii="Calibri" w:cs="Calibri" w:eastAsia="Calibri" w:hAnsi="Calibri"/>
-          <w:b w:val="false"/>
-          <w:bCs w:val="false"/>
-          <w:i w:val="false"/>
-          <w:iCs w:val="false"/>
+        <w:ind w:left="280"/>
+      </w:pPr>
+      <w:r>
+        <w:rPr>
+          <w:rFonts w:ascii="Calibri" w:cs="Calibri" w:eastAsia="Calibri" w:hAnsi="Calibri"/>
           <w:color w:val="4B5563"/>
           <w:sz w:val="19"/>
           <w:szCs w:val="19"/>
         </w:rPr>
-        <w:t xml:space="preserve">Hybrid ResNet152V2/InceptionV3 with a channel-spatial attention module for lung CT classification. 98% accuracy reported.</w:t>
-      </w:r>
-    </w:p>
-    <w:p>
-      <w:pPr>
-        <w:spacing w:after="20" w:before="40" w:line="252" w:lineRule="auto"/>
+        <w:t xml:space="preserve">Hybrid ResNet152V2 / InceptionV3 with channel-spatial attention for lung CT classification. 98% accuracy reported.</w:t>
+      </w:r>
+    </w:p>
+    <w:p>
+      <w:pPr>
+        <w:spacing w:after="0" w:before="40" w:line="252" w:lineRule="auto"/>
         <w:ind w:left="280" w:hanging="180"/>
       </w:pPr>
       <w:r>
@@ -1349,20 +1339,17 @@
     </w:p>
     <w:p>
       <w:pPr>
-        <w:spacing w:after="40" w:before="0"/>
-      </w:pPr>
-      <w:r>
-        <w:rPr>
-          <w:rFonts w:ascii="Calibri" w:cs="Calibri" w:eastAsia="Calibri" w:hAnsi="Calibri"/>
-          <w:b w:val="false"/>
-          <w:bCs w:val="false"/>
-          <w:i w:val="false"/>
-          <w:iCs w:val="false"/>
+        <w:spacing w:after="20" w:before="0"/>
+        <w:ind w:left="280"/>
+      </w:pPr>
+      <w:r>
+        <w:rPr>
+          <w:rFonts w:ascii="Calibri" w:cs="Calibri" w:eastAsia="Calibri" w:hAnsi="Calibri"/>
           <w:color w:val="4B5563"/>
           <w:sz w:val="19"/>
           <w:szCs w:val="19"/>
         </w:rPr>
-        <w:t xml:space="preserve">Ensemble DenseNet121/EfficientNetB0 with explainable AI on 12,447 CT images. 98.98% accuracy and 98.60% F1-score reported.</w:t>
+        <w:t xml:space="preserve">Ensemble deep learning with explainable AI on 12,447 CT images. 98.98% accuracy, 98.60% F1-score reported.</w:t>
       </w:r>
     </w:p>
     <w:sectPr>

</xml_diff>

<commit_message>
feat(resume): optimize CV with precise business logic, accurate skills, and dual PDF/DOCX generation
</commit_message>
<xml_diff>
--- a/public/Tanvir_Ahmmed_Sifat_Resume.docx
+++ b/public/Tanvir_Ahmmed_Sifat_Resume.docx
@@ -4,7 +4,7 @@
   <w:body>
     <w:p>
       <w:pPr>
-        <w:spacing w:after="40" w:before="0"/>
+        <w:spacing w:after="30" w:before="0"/>
       </w:pPr>
       <w:r>
         <w:rPr>
@@ -12,40 +12,31 @@
           <w:b/>
           <w:bCs/>
           <w:color w:val="0F1A14"/>
-          <w:spacing w:val="30"/>
-          <w:sz w:val="46"/>
-          <w:szCs w:val="46"/>
+          <w:spacing w:val="25"/>
+          <w:sz w:val="44"/>
+          <w:szCs w:val="44"/>
         </w:rPr>
         <w:t xml:space="preserve">TANVIR AHMMED SIFAT</w:t>
       </w:r>
     </w:p>
     <w:p>
       <w:pPr>
-        <w:spacing w:after="80" w:before="0"/>
+        <w:spacing w:after="60" w:before="0"/>
       </w:pPr>
       <w:r>
         <w:rPr>
           <w:rFonts w:ascii="Calibri" w:cs="Calibri" w:eastAsia="Calibri" w:hAnsi="Calibri"/>
           <w:color w:val="6B7280"/>
-          <w:sz w:val="22"/>
-          <w:szCs w:val="22"/>
-        </w:rPr>
-        <w:t xml:space="preserve">Web Developer  ·  Full-Stack Engineer  ·  Applied AI Researcher</w:t>
+          <w:sz w:val="21"/>
+          <w:szCs w:val="21"/>
+        </w:rPr>
+        <w:t xml:space="preserve">Web Developer  ·  Full Stack Engineer  ·  Applied AI Researcher</w:t>
       </w:r>
     </w:p>
     <w:p>
       <w:pPr>
         <w:spacing w:after="0" w:before="0"/>
       </w:pPr>
-      <w:r>
-        <w:rPr>
-          <w:rFonts w:ascii="Calibri" w:cs="Calibri" w:eastAsia="Calibri" w:hAnsi="Calibri"/>
-          <w:color w:val="6B7280"/>
-          <w:sz w:val="19"/>
-          <w:szCs w:val="19"/>
-        </w:rPr>
-        <w:t xml:space="preserve">Bangladesh  ·  </w:t>
-      </w:r>
       <w:r>
         <w:rPr>
           <w:rFonts w:ascii="Calibri" w:cs="Calibri" w:eastAsia="Calibri" w:hAnsi="Calibri"/>
@@ -97,12 +88,12 @@
         <w:pBdr>
           <w:top w:val="single" w:color="1A6647" w:sz="6" w:space="0"/>
         </w:pBdr>
-        <w:spacing w:after="0" w:before="220"/>
-      </w:pPr>
-    </w:p>
-    <w:p>
-      <w:pPr>
-        <w:spacing w:after="80" w:before="40"/>
+        <w:spacing w:after="0" w:before="200"/>
+      </w:pPr>
+    </w:p>
+    <w:p>
+      <w:pPr>
+        <w:spacing w:after="60" w:before="40"/>
       </w:pPr>
       <w:r>
         <w:rPr>
@@ -114,7 +105,7 @@
           <w:sz w:val="20"/>
           <w:szCs w:val="20"/>
         </w:rPr>
-        <w:t xml:space="preserve">SUMMARY</w:t>
+        <w:t xml:space="preserve">PROFESSIONAL SUMMARY</w:t>
       </w:r>
     </w:p>
     <w:p>
@@ -125,10 +116,10 @@
         <w:rPr>
           <w:rFonts w:ascii="Calibri" w:cs="Calibri" w:eastAsia="Calibri" w:hAnsi="Calibri"/>
           <w:color w:val="1F2937"/>
-          <w:sz w:val="20"/>
-          <w:szCs w:val="20"/>
-        </w:rPr>
-        <w:t xml:space="preserve">Web developer with over two years building and maintaining production web applications using Angular, React, and Next.js. At UTRDL, implements frontend features and integrates APIs for client portals across finance, real estate, and venture capital. Has contributed to paid client platforms as part of collaborative development teams. Currently completing an M.Sc. in ICT, with three peer-reviewed publications in applied deep learning.</w:t>
+          <w:sz w:val="19"/>
+          <w:szCs w:val="19"/>
+        </w:rPr>
+        <w:t xml:space="preserve">Web developer with 2+ years of professional experience translating business requirements into responsive, production-ready web applications using Angular, React, and Next.js, backed by Node.js / Express REST APIs. Contributed across multiple production platforms, including Bazarica, a live multi-vendor marketplace with payment integration. Completing an M.Sc. in ICT at MBSTU with three co-authored, peer-reviewed publications in applied deep learning and medical imaging.</w:t>
       </w:r>
     </w:p>
     <w:p>
@@ -136,12 +127,12 @@
         <w:pBdr>
           <w:top w:val="single" w:color="1A6647" w:sz="6" w:space="0"/>
         </w:pBdr>
-        <w:spacing w:after="0" w:before="220"/>
-      </w:pPr>
-    </w:p>
-    <w:p>
-      <w:pPr>
-        <w:spacing w:after="80" w:before="40"/>
+        <w:spacing w:after="0" w:before="200"/>
+      </w:pPr>
+    </w:p>
+    <w:p>
+      <w:pPr>
+        <w:spacing w:after="60" w:before="40"/>
       </w:pPr>
       <w:r>
         <w:rPr>
@@ -158,7 +149,7 @@
     </w:p>
     <w:p>
       <w:pPr>
-        <w:spacing w:after="40" w:before="0"/>
+        <w:spacing w:after="36" w:before="0"/>
       </w:pPr>
       <w:r>
         <w:rPr>
@@ -175,15 +166,15 @@
         <w:rPr>
           <w:rFonts w:ascii="Calibri" w:cs="Calibri" w:eastAsia="Calibri" w:hAnsi="Calibri"/>
           <w:color w:val="4B5563"/>
-          <w:sz w:val="20"/>
-          <w:szCs w:val="20"/>
-        </w:rPr>
-        <w:t xml:space="preserve">Angular, React, Next.js, TypeScript, JavaScript, HTML5, CSS3, Tailwind CSS, Bootstrap, SCSS, Angular Material</w:t>
-      </w:r>
-    </w:p>
-    <w:p>
-      <w:pPr>
-        <w:spacing w:after="40" w:before="0"/>
+          <w:sz w:val="19"/>
+          <w:szCs w:val="19"/>
+        </w:rPr>
+        <w:t xml:space="preserve">Angular, React, Next.js, TypeScript, JavaScript (ES6+), HTML5, CSS3, Sass/SCSS, Tailwind CSS, Bootstrap, Angular Material, Material UI</w:t>
+      </w:r>
+    </w:p>
+    <w:p>
+      <w:pPr>
+        <w:spacing w:after="36" w:before="0"/>
       </w:pPr>
       <w:r>
         <w:rPr>
@@ -200,85 +191,110 @@
         <w:rPr>
           <w:rFonts w:ascii="Calibri" w:cs="Calibri" w:eastAsia="Calibri" w:hAnsi="Calibri"/>
           <w:color w:val="4B5563"/>
-          <w:sz w:val="20"/>
-          <w:szCs w:val="20"/>
-        </w:rPr>
-        <w:t xml:space="preserve">Node.js, Express.js, REST API integration, JWT authentication, payment gateway integration</w:t>
-      </w:r>
-    </w:p>
-    <w:p>
-      <w:pPr>
-        <w:spacing w:after="40" w:before="0"/>
-      </w:pPr>
-      <w:r>
-        <w:rPr>
-          <w:rFonts w:ascii="Calibri" w:cs="Calibri" w:eastAsia="Calibri" w:hAnsi="Calibri"/>
-          <w:b/>
-          <w:bCs/>
-          <w:color w:val="1F2937"/>
-          <w:sz w:val="20"/>
-          <w:szCs w:val="20"/>
-        </w:rPr>
-        <w:t xml:space="preserve">Databases: </w:t>
+          <w:sz w:val="19"/>
+          <w:szCs w:val="19"/>
+        </w:rPr>
+        <w:t xml:space="preserve">Node.js, Express.js, REST API Design &amp; Integration, Authentication, JWT, CRUD, Payment Gateway Integration</w:t>
+      </w:r>
+    </w:p>
+    <w:p>
+      <w:pPr>
+        <w:spacing w:after="36" w:before="0"/>
+      </w:pPr>
+      <w:r>
+        <w:rPr>
+          <w:rFonts w:ascii="Calibri" w:cs="Calibri" w:eastAsia="Calibri" w:hAnsi="Calibri"/>
+          <w:b/>
+          <w:bCs/>
+          <w:color w:val="1F2937"/>
+          <w:sz w:val="20"/>
+          <w:szCs w:val="20"/>
+        </w:rPr>
+        <w:t xml:space="preserve">Databases &amp; State: </w:t>
       </w:r>
       <w:r>
         <w:rPr>
           <w:rFonts w:ascii="Calibri" w:cs="Calibri" w:eastAsia="Calibri" w:hAnsi="Calibri"/>
           <w:color w:val="4B5563"/>
-          <w:sz w:val="20"/>
-          <w:szCs w:val="20"/>
-        </w:rPr>
-        <w:t xml:space="preserve">MongoDB, MySQL, Firebase, Supabase</w:t>
-      </w:r>
-    </w:p>
-    <w:p>
-      <w:pPr>
-        <w:spacing w:after="40" w:before="0"/>
-      </w:pPr>
-      <w:r>
-        <w:rPr>
-          <w:rFonts w:ascii="Calibri" w:cs="Calibri" w:eastAsia="Calibri" w:hAnsi="Calibri"/>
-          <w:b/>
-          <w:bCs/>
-          <w:color w:val="1F2937"/>
-          <w:sz w:val="20"/>
-          <w:szCs w:val="20"/>
-        </w:rPr>
-        <w:t xml:space="preserve">Deployment &amp; Tools: </w:t>
+          <w:sz w:val="19"/>
+          <w:szCs w:val="19"/>
+        </w:rPr>
+        <w:t xml:space="preserve">MongoDB, MySQL, Firebase, Redux Toolkit, Context API</w:t>
+      </w:r>
+    </w:p>
+    <w:p>
+      <w:pPr>
+        <w:spacing w:after="36" w:before="0"/>
+      </w:pPr>
+      <w:r>
+        <w:rPr>
+          <w:rFonts w:ascii="Calibri" w:cs="Calibri" w:eastAsia="Calibri" w:hAnsi="Calibri"/>
+          <w:b/>
+          <w:bCs/>
+          <w:color w:val="1F2937"/>
+          <w:sz w:val="20"/>
+          <w:szCs w:val="20"/>
+        </w:rPr>
+        <w:t xml:space="preserve">Deployment &amp; Cloud: </w:t>
       </w:r>
       <w:r>
         <w:rPr>
           <w:rFonts w:ascii="Calibri" w:cs="Calibri" w:eastAsia="Calibri" w:hAnsi="Calibri"/>
           <w:color w:val="4B5563"/>
-          <w:sz w:val="20"/>
-          <w:szCs w:val="20"/>
-        </w:rPr>
-        <w:t xml:space="preserve">Git, GitHub, IIS Server, Vercel, Azure VPS, cPanel, Postman, Figma, Google Analytics</w:t>
-      </w:r>
-    </w:p>
-    <w:p>
-      <w:pPr>
-        <w:spacing w:after="40" w:before="0"/>
-      </w:pPr>
-      <w:r>
-        <w:rPr>
-          <w:rFonts w:ascii="Calibri" w:cs="Calibri" w:eastAsia="Calibri" w:hAnsi="Calibri"/>
-          <w:b/>
-          <w:bCs/>
-          <w:color w:val="1F2937"/>
-          <w:sz w:val="20"/>
-          <w:szCs w:val="20"/>
-        </w:rPr>
-        <w:t xml:space="preserve">AI / ML &amp; Research: </w:t>
+          <w:sz w:val="19"/>
+          <w:szCs w:val="19"/>
+        </w:rPr>
+        <w:t xml:space="preserve">IIS Server, Azure VPS, VPS, cPanel, Vercel</w:t>
+      </w:r>
+    </w:p>
+    <w:p>
+      <w:pPr>
+        <w:spacing w:after="36" w:before="0"/>
+      </w:pPr>
+      <w:r>
+        <w:rPr>
+          <w:rFonts w:ascii="Calibri" w:cs="Calibri" w:eastAsia="Calibri" w:hAnsi="Calibri"/>
+          <w:b/>
+          <w:bCs/>
+          <w:color w:val="1F2937"/>
+          <w:sz w:val="20"/>
+          <w:szCs w:val="20"/>
+        </w:rPr>
+        <w:t xml:space="preserve">Developer Tools: </w:t>
       </w:r>
       <w:r>
         <w:rPr>
           <w:rFonts w:ascii="Calibri" w:cs="Calibri" w:eastAsia="Calibri" w:hAnsi="Calibri"/>
           <w:color w:val="4B5563"/>
-          <w:sz w:val="20"/>
-          <w:szCs w:val="20"/>
-        </w:rPr>
-        <w:t xml:space="preserve">Python, TensorFlow, deep learning, computer vision, medical image analysis</w:t>
+          <w:sz w:val="19"/>
+          <w:szCs w:val="19"/>
+        </w:rPr>
+        <w:t xml:space="preserve">Git, GitHub, VS Code, Postman, Figma, Google Analytics</w:t>
+      </w:r>
+    </w:p>
+    <w:p>
+      <w:pPr>
+        <w:spacing w:after="36" w:before="0"/>
+      </w:pPr>
+      <w:r>
+        <w:rPr>
+          <w:rFonts w:ascii="Calibri" w:cs="Calibri" w:eastAsia="Calibri" w:hAnsi="Calibri"/>
+          <w:b/>
+          <w:bCs/>
+          <w:color w:val="1F2937"/>
+          <w:sz w:val="20"/>
+          <w:szCs w:val="20"/>
+        </w:rPr>
+        <w:t xml:space="preserve">AI / ML Research: </w:t>
+      </w:r>
+      <w:r>
+        <w:rPr>
+          <w:rFonts w:ascii="Calibri" w:cs="Calibri" w:eastAsia="Calibri" w:hAnsi="Calibri"/>
+          <w:color w:val="4B5563"/>
+          <w:sz w:val="19"/>
+          <w:szCs w:val="19"/>
+        </w:rPr>
+        <w:t xml:space="preserve">Python, TensorFlow, Keras, Deep Learning, Computer Vision, Medical Image Analysis</w:t>
       </w:r>
     </w:p>
     <w:p>
@@ -286,12 +302,12 @@
         <w:pBdr>
           <w:top w:val="single" w:color="1A6647" w:sz="6" w:space="0"/>
         </w:pBdr>
-        <w:spacing w:after="0" w:before="220"/>
-      </w:pPr>
-    </w:p>
-    <w:p>
-      <w:pPr>
-        <w:spacing w:after="80" w:before="40"/>
+        <w:spacing w:after="0" w:before="200"/>
+      </w:pPr>
+    </w:p>
+    <w:p>
+      <w:pPr>
+        <w:spacing w:after="60" w:before="40"/>
       </w:pPr>
       <w:r>
         <w:rPr>
@@ -303,7 +319,7 @@
           <w:sz w:val="20"/>
           <w:szCs w:val="20"/>
         </w:rPr>
-        <w:t xml:space="preserve">EXPERIENCE</w:t>
+        <w:t xml:space="preserve">PROFESSIONAL EXPERIENCE</w:t>
       </w:r>
     </w:p>
     <w:p>
@@ -311,16 +327,16 @@
         <w:tabs>
           <w:tab w:val="right" w:pos="9026"/>
         </w:tabs>
-        <w:spacing w:after="0" w:before="120"/>
-      </w:pPr>
-      <w:r>
-        <w:rPr>
-          <w:rFonts w:ascii="Calibri" w:cs="Calibri" w:eastAsia="Calibri" w:hAnsi="Calibri"/>
-          <w:b/>
-          <w:bCs/>
-          <w:color w:val="1F2937"/>
-          <w:sz w:val="23"/>
-          <w:szCs w:val="23"/>
+        <w:spacing w:after="0" w:before="100"/>
+      </w:pPr>
+      <w:r>
+        <w:rPr>
+          <w:rFonts w:ascii="Calibri" w:cs="Calibri" w:eastAsia="Calibri" w:hAnsi="Calibri"/>
+          <w:b/>
+          <w:bCs/>
+          <w:color w:val="1F2937"/>
+          <w:sz w:val="22"/>
+          <w:szCs w:val="22"/>
         </w:rPr>
         <w:t xml:space="preserve">Web Developer</w:t>
       </w:r>
@@ -340,12 +356,12 @@
           <w:sz w:val="20"/>
           <w:szCs w:val="20"/>
         </w:rPr>
-        <w:t xml:space="preserve">Jun 2024 — Present</w:t>
-      </w:r>
-    </w:p>
-    <w:p>
-      <w:pPr>
-        <w:spacing w:after="60" w:before="0"/>
+        <w:t xml:space="preserve">Jun 2024 – Present</w:t>
+      </w:r>
+    </w:p>
+    <w:p>
+      <w:pPr>
+        <w:spacing w:after="50" w:before="0"/>
       </w:pPr>
       <w:r>
         <w:rPr>
@@ -354,7 +370,7 @@
           <w:sz w:val="20"/>
           <w:szCs w:val="20"/>
         </w:rPr>
-        <w:t xml:space="preserve">Universal Technology Research and Development Ltd. · Bangladesh · Full-time</w:t>
+        <w:t xml:space="preserve">Universal Technology Research and Development Ltd. · Remote / Bangladesh · Full-time</w:t>
       </w:r>
     </w:p>
     <w:p>
@@ -364,17 +380,17 @@
           <w:ilvl w:val="0"/>
           <w:numId w:val="1"/>
         </w:numPr>
-        <w:spacing w:after="36" w:before="0" w:line="252" w:lineRule="auto"/>
-        <w:ind w:left="360" w:hanging="180"/>
-      </w:pPr>
-      <w:r>
-        <w:rPr>
-          <w:rFonts w:ascii="Calibri" w:cs="Calibri" w:eastAsia="Calibri" w:hAnsi="Calibri"/>
-          <w:color w:val="1F2937"/>
-          <w:sz w:val="20"/>
-          <w:szCs w:val="20"/>
-        </w:rPr>
-        <w:t xml:space="preserve">Implemented frontend features and workflow updates in Angular and React/Next.js for UK and UAE client applications in mortgage finance, commercial real estate, and venture capital.</w:t>
+        <w:spacing w:after="32" w:before="0" w:line="248" w:lineRule="auto"/>
+        <w:ind w:left="340" w:hanging="180"/>
+      </w:pPr>
+      <w:r>
+        <w:rPr>
+          <w:rFonts w:ascii="Calibri" w:cs="Calibri" w:eastAsia="Calibri" w:hAnsi="Calibri"/>
+          <w:color w:val="1F2937"/>
+          <w:sz w:val="19"/>
+          <w:szCs w:val="19"/>
+        </w:rPr>
+        <w:t xml:space="preserve">Translate evolving business requirements into responsive frontend features and workflow updates across client applications in mortgage finance, commercial real estate, and venture capital using Angular and Next.js.</w:t>
       </w:r>
     </w:p>
     <w:p>
@@ -384,17 +400,17 @@
           <w:ilvl w:val="0"/>
           <w:numId w:val="1"/>
         </w:numPr>
-        <w:spacing w:after="36" w:before="0" w:line="252" w:lineRule="auto"/>
-        <w:ind w:left="360" w:hanging="180"/>
-      </w:pPr>
-      <w:r>
-        <w:rPr>
-          <w:rFonts w:ascii="Calibri" w:cs="Calibri" w:eastAsia="Calibri" w:hAnsi="Calibri"/>
-          <w:color w:val="1F2937"/>
-          <w:sz w:val="20"/>
-          <w:szCs w:val="20"/>
-        </w:rPr>
-        <w:t xml:space="preserve">Built and maintained client-facing portals including a mortgage broker dashboard with loan calculators, multi-step application forms, and document upload; and a commercial real estate platform with interactive map search and location filtering.</w:t>
+        <w:spacing w:after="32" w:before="0" w:line="248" w:lineRule="auto"/>
+        <w:ind w:left="340" w:hanging="180"/>
+      </w:pPr>
+      <w:r>
+        <w:rPr>
+          <w:rFonts w:ascii="Calibri" w:cs="Calibri" w:eastAsia="Calibri" w:hAnsi="Calibri"/>
+          <w:color w:val="1F2937"/>
+          <w:sz w:val="19"/>
+          <w:szCs w:val="19"/>
+        </w:rPr>
+        <w:t xml:space="preserve">Build and maintain client-facing portals including mortgage broker dashboards with loan calculation tools, multi-step application forms, and document upload features; and real estate platforms with interactive map search and location filtering.</w:t>
       </w:r>
     </w:p>
     <w:p>
@@ -404,17 +420,17 @@
           <w:ilvl w:val="0"/>
           <w:numId w:val="1"/>
         </w:numPr>
-        <w:spacing w:after="36" w:before="0" w:line="252" w:lineRule="auto"/>
-        <w:ind w:left="360" w:hanging="180"/>
-      </w:pPr>
-      <w:r>
-        <w:rPr>
-          <w:rFonts w:ascii="Calibri" w:cs="Calibri" w:eastAsia="Calibri" w:hAnsi="Calibri"/>
-          <w:color w:val="1F2937"/>
-          <w:sz w:val="20"/>
-          <w:szCs w:val="20"/>
-        </w:rPr>
-        <w:t xml:space="preserve">Integrated REST APIs across frontend modules — handling data fetching, loading and error states, and adapting to changing API contracts as business requirements evolved.</w:t>
+        <w:spacing w:after="32" w:before="0" w:line="248" w:lineRule="auto"/>
+        <w:ind w:left="340" w:hanging="180"/>
+      </w:pPr>
+      <w:r>
+        <w:rPr>
+          <w:rFonts w:ascii="Calibri" w:cs="Calibri" w:eastAsia="Calibri" w:hAnsi="Calibri"/>
+          <w:color w:val="1F2937"/>
+          <w:sz w:val="19"/>
+          <w:szCs w:val="19"/>
+        </w:rPr>
+        <w:t xml:space="preserve">Integrate REST APIs end to end — managing data contracts, request validation, loading and error states, and coordinating contract updates with the backend team as application logic evolves.</w:t>
       </w:r>
     </w:p>
     <w:p>
@@ -424,22 +440,22 @@
           <w:ilvl w:val="0"/>
           <w:numId w:val="1"/>
         </w:numPr>
-        <w:spacing w:after="36" w:before="0" w:line="252" w:lineRule="auto"/>
-        <w:ind w:left="360" w:hanging="180"/>
-      </w:pPr>
-      <w:r>
-        <w:rPr>
-          <w:rFonts w:ascii="Calibri" w:cs="Calibri" w:eastAsia="Calibri" w:hAnsi="Calibri"/>
-          <w:color w:val="1F2937"/>
-          <w:sz w:val="20"/>
-          <w:szCs w:val="20"/>
-        </w:rPr>
-        <w:t xml:space="preserve">Built shared Angular Material and custom component libraries to maintain UI consistency across projects; managed production IIS Server builds and deployments.</w:t>
-      </w:r>
-    </w:p>
-    <w:p>
-      <w:pPr>
-        <w:spacing w:after="60" w:before="0"/>
+        <w:spacing w:after="32" w:before="0" w:line="248" w:lineRule="auto"/>
+        <w:ind w:left="340" w:hanging="180"/>
+      </w:pPr>
+      <w:r>
+        <w:rPr>
+          <w:rFonts w:ascii="Calibri" w:cs="Calibri" w:eastAsia="Calibri" w:hAnsi="Calibri"/>
+          <w:color w:val="1F2937"/>
+          <w:sz w:val="19"/>
+          <w:szCs w:val="19"/>
+        </w:rPr>
+        <w:t xml:space="preserve">Develop and maintain reusable UI component libraries with TypeScript to enforce design consistency across modules, and manage production IIS Server builds and deployments.</w:t>
+      </w:r>
+    </w:p>
+    <w:p>
+      <w:pPr>
+        <w:spacing w:after="50" w:before="0"/>
       </w:pPr>
     </w:p>
     <w:p>
@@ -447,18 +463,18 @@
         <w:tabs>
           <w:tab w:val="right" w:pos="9026"/>
         </w:tabs>
-        <w:spacing w:after="0" w:before="120"/>
-      </w:pPr>
-      <w:r>
-        <w:rPr>
-          <w:rFonts w:ascii="Calibri" w:cs="Calibri" w:eastAsia="Calibri" w:hAnsi="Calibri"/>
-          <w:b/>
-          <w:bCs/>
-          <w:color w:val="1F2937"/>
-          <w:sz w:val="23"/>
-          <w:szCs w:val="23"/>
-        </w:rPr>
-        <w:t xml:space="preserve">Full-Stack Developer</w:t>
+        <w:spacing w:after="0" w:before="100"/>
+      </w:pPr>
+      <w:r>
+        <w:rPr>
+          <w:rFonts w:ascii="Calibri" w:cs="Calibri" w:eastAsia="Calibri" w:hAnsi="Calibri"/>
+          <w:b/>
+          <w:bCs/>
+          <w:color w:val="1F2937"/>
+          <w:sz w:val="22"/>
+          <w:szCs w:val="22"/>
+        </w:rPr>
+        <w:t xml:space="preserve">Full Stack Developer</w:t>
       </w:r>
       <w:r>
         <w:rPr>
@@ -476,12 +492,12 @@
           <w:sz w:val="20"/>
           <w:szCs w:val="20"/>
         </w:rPr>
-        <w:t xml:space="preserve">2024 — Present</w:t>
-      </w:r>
-    </w:p>
-    <w:p>
-      <w:pPr>
-        <w:spacing w:after="60" w:before="0"/>
+        <w:t xml:space="preserve">2024 – Present</w:t>
+      </w:r>
+    </w:p>
+    <w:p>
+      <w:pPr>
+        <w:spacing w:after="50" w:before="0"/>
       </w:pPr>
       <w:r>
         <w:rPr>
@@ -500,17 +516,17 @@
           <w:ilvl w:val="0"/>
           <w:numId w:val="1"/>
         </w:numPr>
-        <w:spacing w:after="36" w:before="0" w:line="252" w:lineRule="auto"/>
-        <w:ind w:left="360" w:hanging="180"/>
-      </w:pPr>
-      <w:r>
-        <w:rPr>
-          <w:rFonts w:ascii="Calibri" w:cs="Calibri" w:eastAsia="Calibri" w:hAnsi="Calibri"/>
-          <w:color w:val="1F2937"/>
-          <w:sz w:val="20"/>
-          <w:szCs w:val="20"/>
-        </w:rPr>
-        <w:t xml:space="preserve">Contributed to three paid client e-commerce platforms in three-person development teams, working across React and Next.js frontends and Node.js/Express REST APIs.</w:t>
+        <w:spacing w:after="32" w:before="0" w:line="248" w:lineRule="auto"/>
+        <w:ind w:left="340" w:hanging="180"/>
+      </w:pPr>
+      <w:r>
+        <w:rPr>
+          <w:rFonts w:ascii="Calibri" w:cs="Calibri" w:eastAsia="Calibri" w:hAnsi="Calibri"/>
+          <w:color w:val="1F2937"/>
+          <w:sz w:val="19"/>
+          <w:szCs w:val="19"/>
+        </w:rPr>
+        <w:t xml:space="preserve">Collaborated in small developer teams to deliver three paid client web platforms, building React / Next.js frontends and Node.js / Express REST APIs for authentication, product catalogs, and order workflows.</w:t>
       </w:r>
     </w:p>
     <w:p>
@@ -520,17 +536,97 @@
           <w:ilvl w:val="0"/>
           <w:numId w:val="1"/>
         </w:numPr>
-        <w:spacing w:after="36" w:before="0" w:line="252" w:lineRule="auto"/>
-        <w:ind w:left="360" w:hanging="180"/>
-      </w:pPr>
-      <w:r>
-        <w:rPr>
-          <w:rFonts w:ascii="Calibri" w:cs="Calibri" w:eastAsia="Calibri" w:hAnsi="Calibri"/>
-          <w:color w:val="1F2937"/>
-          <w:sz w:val="20"/>
-          <w:szCs w:val="20"/>
-        </w:rPr>
-        <w:t xml:space="preserve">Implemented authentication, product catalog, order management, multi-vendor dashboards, and cart-to-checkout flows; set up SEO metadata and Google Analytics for client storefronts.</w:t>
+        <w:spacing w:after="32" w:before="0" w:line="248" w:lineRule="auto"/>
+        <w:ind w:left="340" w:hanging="180"/>
+      </w:pPr>
+      <w:r>
+        <w:rPr>
+          <w:rFonts w:ascii="Calibri" w:cs="Calibri" w:eastAsia="Calibri" w:hAnsi="Calibri"/>
+          <w:color w:val="1F2937"/>
+          <w:sz w:val="19"/>
+          <w:szCs w:val="19"/>
+        </w:rPr>
+        <w:t xml:space="preserve">Configured and supported production deployments across Azure VPS, cPanel, and Vercel, including custom domain setup, SEO metadata, and Google Analytics integration.</w:t>
+      </w:r>
+    </w:p>
+    <w:p>
+      <w:pPr>
+        <w:pBdr>
+          <w:top w:val="single" w:color="1A6647" w:sz="6" w:space="0"/>
+        </w:pBdr>
+        <w:spacing w:after="0" w:before="200"/>
+      </w:pPr>
+    </w:p>
+    <w:p>
+      <w:pPr>
+        <w:spacing w:after="60" w:before="40"/>
+      </w:pPr>
+      <w:r>
+        <w:rPr>
+          <w:rFonts w:ascii="Calibri" w:cs="Calibri" w:eastAsia="Calibri" w:hAnsi="Calibri"/>
+          <w:b/>
+          <w:bCs/>
+          <w:color w:val="1A6647"/>
+          <w:spacing w:val="40"/>
+          <w:sz w:val="20"/>
+          <w:szCs w:val="20"/>
+        </w:rPr>
+        <w:t xml:space="preserve">SELECTED PROJECTS</w:t>
+      </w:r>
+    </w:p>
+    <w:p>
+      <w:pPr>
+        <w:tabs>
+          <w:tab w:val="right" w:pos="9026"/>
+        </w:tabs>
+        <w:spacing w:after="0" w:before="100"/>
+      </w:pPr>
+      <w:r>
+        <w:rPr>
+          <w:rFonts w:ascii="Calibri" w:cs="Calibri" w:eastAsia="Calibri" w:hAnsi="Calibri"/>
+          <w:b/>
+          <w:bCs/>
+          <w:color w:val="1F2937"/>
+          <w:sz w:val="21"/>
+          <w:szCs w:val="21"/>
+        </w:rPr>
+        <w:t xml:space="preserve">Bazarica — Multi-Vendor Marketplace</w:t>
+      </w:r>
+      <w:r>
+        <w:rPr>
+          <w:rFonts w:ascii="Calibri" w:cs="Calibri" w:eastAsia="Calibri" w:hAnsi="Calibri"/>
+          <w:color w:val="6B7280"/>
+          <w:sz w:val="20"/>
+          <w:szCs w:val="20"/>
+        </w:rPr>
+        <w:t xml:space="preserve">  ·  </w:t>
+      </w:r>
+      <w:r>
+        <w:rPr>
+          <w:rFonts w:ascii="Calibri" w:cs="Calibri" w:eastAsia="Calibri" w:hAnsi="Calibri"/>
+          <w:color w:val="1A6647"/>
+          <w:sz w:val="20"/>
+          <w:szCs w:val="20"/>
+        </w:rPr>
+        <w:t xml:space="preserve">bazarica.com.bd</w:t>
+      </w:r>
+      <w:r>
+        <w:rPr>
+          <w:sz w:val="20"/>
+          <w:szCs w:val="20"/>
+        </w:rPr>
+        <w:t xml:space="preserve">	</w:t>
+      </w:r>
+      <w:r>
+        <w:rPr>
+          <w:rFonts w:ascii="Calibri" w:cs="Calibri" w:eastAsia="Calibri" w:hAnsi="Calibri"/>
+          <w:i/>
+          <w:iCs/>
+          <w:color w:val="6B7280"/>
+          <w:sz w:val="18"/>
+          <w:szCs w:val="18"/>
+        </w:rPr>
+        <w:t xml:space="preserve">Next.js · React · Redux · Node.js · Express · MongoDB · Azure VPS</w:t>
       </w:r>
     </w:p>
     <w:p>
@@ -540,50 +636,50 @@
           <w:ilvl w:val="0"/>
           <w:numId w:val="1"/>
         </w:numPr>
-        <w:spacing w:after="36" w:before="0" w:line="252" w:lineRule="auto"/>
-        <w:ind w:left="360" w:hanging="180"/>
-      </w:pPr>
-      <w:r>
-        <w:rPr>
-          <w:rFonts w:ascii="Calibri" w:cs="Calibri" w:eastAsia="Calibri" w:hAnsi="Calibri"/>
-          <w:color w:val="1F2937"/>
-          <w:sz w:val="20"/>
-          <w:szCs w:val="20"/>
-        </w:rPr>
-        <w:t xml:space="preserve">Deployed and configured applications on cPanel, VPS, and Azure for live production traffic.</w:t>
-      </w:r>
-    </w:p>
-    <w:p>
-      <w:pPr>
-        <w:pBdr>
-          <w:top w:val="single" w:color="1A6647" w:sz="6" w:space="0"/>
-        </w:pBdr>
-        <w:spacing w:after="0" w:before="220"/>
-      </w:pPr>
-    </w:p>
-    <w:p>
-      <w:pPr>
-        <w:spacing w:after="80" w:before="40"/>
-      </w:pPr>
-      <w:r>
-        <w:rPr>
-          <w:rFonts w:ascii="Calibri" w:cs="Calibri" w:eastAsia="Calibri" w:hAnsi="Calibri"/>
-          <w:b/>
-          <w:bCs/>
-          <w:color w:val="1A6647"/>
-          <w:spacing w:val="40"/>
-          <w:sz w:val="20"/>
-          <w:szCs w:val="20"/>
-        </w:rPr>
-        <w:t xml:space="preserve">SELECTED PROJECTS</w:t>
-      </w:r>
+        <w:spacing w:after="32" w:before="0" w:line="248" w:lineRule="auto"/>
+        <w:ind w:left="340" w:hanging="180"/>
+      </w:pPr>
+      <w:r>
+        <w:rPr>
+          <w:rFonts w:ascii="Calibri" w:cs="Calibri" w:eastAsia="Calibri" w:hAnsi="Calibri"/>
+          <w:color w:val="1F2937"/>
+          <w:sz w:val="19"/>
+          <w:szCs w:val="19"/>
+        </w:rPr>
+        <w:t xml:space="preserve">Contributed to a live multi-vendor marketplace where independent sellers manage their own product listings and orders independently, while platform admins review vendor accounts, manage commission structures, and oversee operations.</w:t>
+      </w:r>
+    </w:p>
+    <w:p>
+      <w:pPr>
+        <w:pStyle w:val="ListParagraph"/>
+        <w:numPr>
+          <w:ilvl w:val="0"/>
+          <w:numId w:val="1"/>
+        </w:numPr>
+        <w:spacing w:after="32" w:before="0" w:line="248" w:lineRule="auto"/>
+        <w:ind w:left="340" w:hanging="180"/>
+      </w:pPr>
+      <w:r>
+        <w:rPr>
+          <w:rFonts w:ascii="Calibri" w:cs="Calibri" w:eastAsia="Calibri" w:hAnsi="Calibri"/>
+          <w:color w:val="1F2937"/>
+          <w:sz w:val="19"/>
+          <w:szCs w:val="19"/>
+        </w:rPr>
+        <w:t xml:space="preserve">Implemented payment gateway integration and order confirmation flows, along with role-based dashboards for admins, sellers, and buyers, cross-vendor catalog search, SEO metadata, and production deployment on Azure VPS.</w:t>
+      </w:r>
+    </w:p>
+    <w:p>
+      <w:pPr>
+        <w:spacing w:after="45" w:before="0"/>
+      </w:pPr>
     </w:p>
     <w:p>
       <w:pPr>
         <w:tabs>
           <w:tab w:val="right" w:pos="9026"/>
         </w:tabs>
-        <w:spacing w:after="0" w:before="120"/>
+        <w:spacing w:after="0" w:before="100"/>
       </w:pPr>
       <w:r>
         <w:rPr>
@@ -594,7 +690,7 @@
           <w:sz w:val="21"/>
           <w:szCs w:val="21"/>
         </w:rPr>
-        <w:t xml:space="preserve">Bazarica — Multi-Vendor Marketplace</w:t>
+        <w:t xml:space="preserve">Kahf Treasure — Attar &amp; Fragrance E-Commerce</w:t>
       </w:r>
       <w:r>
         <w:rPr>
@@ -612,7 +708,7 @@
           <w:sz w:val="20"/>
           <w:szCs w:val="20"/>
         </w:rPr>
-        <w:t xml:space="preserve">bazarica.com.bd</w:t>
+        <w:t xml:space="preserve">kahf-treasure.vercel.app</w:t>
       </w:r>
       <w:r>
         <w:rPr>
@@ -630,7 +726,7 @@
           <w:sz w:val="18"/>
           <w:szCs w:val="18"/>
         </w:rPr>
-        <w:t xml:space="preserve">Next.js · Express.js · MongoDB · Azure VPS</w:t>
+        <w:t xml:space="preserve">Next.js · React · Redux Toolkit · Tailwind CSS · Express · MongoDB · Cloudinary</w:t>
       </w:r>
     </w:p>
     <w:p>
@@ -640,17 +736,17 @@
           <w:ilvl w:val="0"/>
           <w:numId w:val="1"/>
         </w:numPr>
-        <w:spacing w:after="36" w:before="0" w:line="252" w:lineRule="auto"/>
-        <w:ind w:left="360" w:hanging="180"/>
-      </w:pPr>
-      <w:r>
-        <w:rPr>
-          <w:rFonts w:ascii="Calibri" w:cs="Calibri" w:eastAsia="Calibri" w:hAnsi="Calibri"/>
-          <w:color w:val="1F2937"/>
-          <w:sz w:val="20"/>
-          <w:szCs w:val="20"/>
-        </w:rPr>
-        <w:t xml:space="preserve">Production marketplace where independent sellers manage their own listings and orders; separate interfaces handle seller inventory, admin oversight, and customer purchasing, each with role-specific permissions.</w:t>
+        <w:spacing w:after="32" w:before="0" w:line="248" w:lineRule="auto"/>
+        <w:ind w:left="340" w:hanging="180"/>
+      </w:pPr>
+      <w:r>
+        <w:rPr>
+          <w:rFonts w:ascii="Calibri" w:cs="Calibri" w:eastAsia="Calibri" w:hAnsi="Calibri"/>
+          <w:color w:val="1F2937"/>
+          <w:sz w:val="19"/>
+          <w:szCs w:val="19"/>
+        </w:rPr>
+        <w:t xml:space="preserve">Full-stack boutique fragrance e-commerce platform featuring a dynamic product catalog with variant pricing, responsive cart drawer, and Cloudinary media optimization.</w:t>
       </w:r>
     </w:p>
     <w:p>
@@ -660,22 +756,22 @@
           <w:ilvl w:val="0"/>
           <w:numId w:val="1"/>
         </w:numPr>
-        <w:spacing w:after="36" w:before="0" w:line="252" w:lineRule="auto"/>
-        <w:ind w:left="360" w:hanging="180"/>
-      </w:pPr>
-      <w:r>
-        <w:rPr>
-          <w:rFonts w:ascii="Calibri" w:cs="Calibri" w:eastAsia="Calibri" w:hAnsi="Calibri"/>
-          <w:color w:val="1F2937"/>
-          <w:sz w:val="20"/>
-          <w:szCs w:val="20"/>
-        </w:rPr>
-        <w:t xml:space="preserve">Contributed role-based dashboards, payment and order confirmation flows, cross-vendor catalog search, SEO and analytics setup, and Azure VPS deployment.</w:t>
-      </w:r>
-    </w:p>
-    <w:p>
-      <w:pPr>
-        <w:spacing w:after="50" w:before="0"/>
+        <w:spacing w:after="32" w:before="0" w:line="248" w:lineRule="auto"/>
+        <w:ind w:left="340" w:hanging="180"/>
+      </w:pPr>
+      <w:r>
+        <w:rPr>
+          <w:rFonts w:ascii="Calibri" w:cs="Calibri" w:eastAsia="Calibri" w:hAnsi="Calibri"/>
+          <w:color w:val="1F2937"/>
+          <w:sz w:val="19"/>
+          <w:szCs w:val="19"/>
+        </w:rPr>
+        <w:t xml:space="preserve">Engineered centralized client cart and session state using Redux Toolkit, backed by an Express REST API and MongoDB data persistence layer.</w:t>
+      </w:r>
+    </w:p>
+    <w:p>
+      <w:pPr>
+        <w:spacing w:after="45" w:before="0"/>
       </w:pPr>
     </w:p>
     <w:p>
@@ -683,7 +779,7 @@
         <w:tabs>
           <w:tab w:val="right" w:pos="9026"/>
         </w:tabs>
-        <w:spacing w:after="0" w:before="120"/>
+        <w:spacing w:after="0" w:before="100"/>
       </w:pPr>
       <w:r>
         <w:rPr>
@@ -694,7 +790,7 @@
           <w:sz w:val="21"/>
           <w:szCs w:val="21"/>
         </w:rPr>
-        <w:t xml:space="preserve">Nirnoy — MCQ Exam Platform</w:t>
+        <w:t xml:space="preserve">Nirnoy — EdTech MCQ Assessment Platform</w:t>
       </w:r>
       <w:r>
         <w:rPr>
@@ -730,7 +826,7 @@
           <w:sz w:val="18"/>
           <w:szCs w:val="18"/>
         </w:rPr>
-        <w:t xml:space="preserve">React · Express.js · MongoDB · Tailwind CSS</w:t>
+        <w:t xml:space="preserve">React · Node.js · Express.js · MongoDB · Tailwind CSS · Zod</w:t>
       </w:r>
     </w:p>
     <w:p>
@@ -740,17 +836,17 @@
           <w:ilvl w:val="0"/>
           <w:numId w:val="1"/>
         </w:numPr>
-        <w:spacing w:after="36" w:before="0" w:line="252" w:lineRule="auto"/>
-        <w:ind w:left="360" w:hanging="180"/>
-      </w:pPr>
-      <w:r>
-        <w:rPr>
-          <w:rFonts w:ascii="Calibri" w:cs="Calibri" w:eastAsia="Calibri" w:hAnsi="Calibri"/>
-          <w:color w:val="1F2937"/>
-          <w:sz w:val="20"/>
-          <w:szCs w:val="20"/>
-        </w:rPr>
-        <w:t xml:space="preserve">Exam platform for students where question delivery, time limits, and grading are enforced server-side — answer data is stripped before sending questions to the client, preventing any client-side exposure ahead of submission.</w:t>
+        <w:spacing w:after="32" w:before="0" w:line="248" w:lineRule="auto"/>
+        <w:ind w:left="340" w:hanging="180"/>
+      </w:pPr>
+      <w:r>
+        <w:rPr>
+          <w:rFonts w:ascii="Calibri" w:cs="Calibri" w:eastAsia="Calibri" w:hAnsi="Calibri"/>
+          <w:color w:val="1F2937"/>
+          <w:sz w:val="19"/>
+          <w:szCs w:val="19"/>
+        </w:rPr>
+        <w:t xml:space="preserve">Engineered a server-authoritative examination flow where question delivery, countdown timing, and scoring are enforced backend-side — stripping correct answers prior to client delivery to eliminate client-side answer inspection.</w:t>
       </w:r>
     </w:p>
     <w:p>
@@ -760,22 +856,22 @@
           <w:ilvl w:val="0"/>
           <w:numId w:val="1"/>
         </w:numPr>
-        <w:spacing w:after="36" w:before="0" w:line="252" w:lineRule="auto"/>
-        <w:ind w:left="360" w:hanging="180"/>
-      </w:pPr>
-      <w:r>
-        <w:rPr>
-          <w:rFonts w:ascii="Calibri" w:cs="Calibri" w:eastAsia="Calibri" w:hAnsi="Calibri"/>
-          <w:color w:val="1F2937"/>
-          <w:sz w:val="20"/>
-          <w:szCs w:val="20"/>
-        </w:rPr>
-        <w:t xml:space="preserve">Built an admin interface for JSON-based exam creation and CSV export; implemented per-student result storage, attempt history, and per-exam leaderboards.</w:t>
-      </w:r>
-    </w:p>
-    <w:p>
-      <w:pPr>
-        <w:spacing w:after="50" w:before="0"/>
+        <w:spacing w:after="32" w:before="0" w:line="248" w:lineRule="auto"/>
+        <w:ind w:left="340" w:hanging="180"/>
+      </w:pPr>
+      <w:r>
+        <w:rPr>
+          <w:rFonts w:ascii="Calibri" w:cs="Calibri" w:eastAsia="Calibri" w:hAnsi="Calibri"/>
+          <w:color w:val="1F2937"/>
+          <w:sz w:val="19"/>
+          <w:szCs w:val="19"/>
+        </w:rPr>
+        <w:t xml:space="preserve">Implemented Zod schema validation across all submission routes, with attempt tracking, score calculation, per-exam leaderboards, and an admin JSON exam importer in MongoDB.</w:t>
+      </w:r>
+    </w:p>
+    <w:p>
+      <w:pPr>
+        <w:spacing w:after="45" w:before="0"/>
       </w:pPr>
     </w:p>
     <w:p>
@@ -783,7 +879,7 @@
         <w:tabs>
           <w:tab w:val="right" w:pos="9026"/>
         </w:tabs>
-        <w:spacing w:after="0" w:before="120"/>
+        <w:spacing w:after="0" w:before="100"/>
       </w:pPr>
       <w:r>
         <w:rPr>
@@ -794,7 +890,7 @@
           <w:sz w:val="21"/>
           <w:szCs w:val="21"/>
         </w:rPr>
-        <w:t xml:space="preserve">Outfitro — Fashion E-Commerce</w:t>
+        <w:t xml:space="preserve">Outfitro — E-Commerce Platform</w:t>
       </w:r>
       <w:r>
         <w:rPr>
@@ -830,7 +926,7 @@
           <w:sz w:val="18"/>
           <w:szCs w:val="18"/>
         </w:rPr>
-        <w:t xml:space="preserve">React · Express.js · Node.js · MongoDB · cPanel</w:t>
+        <w:t xml:space="preserve">React · Node.js · Express · MongoDB · Sass/SCSS · cPanel</w:t>
       </w:r>
     </w:p>
     <w:p>
@@ -840,77 +936,17 @@
           <w:ilvl w:val="0"/>
           <w:numId w:val="1"/>
         </w:numPr>
-        <w:spacing w:after="36" w:before="0" w:line="252" w:lineRule="auto"/>
-        <w:ind w:left="360" w:hanging="180"/>
-      </w:pPr>
-      <w:r>
-        <w:rPr>
-          <w:rFonts w:ascii="Calibri" w:cs="Calibri" w:eastAsia="Calibri" w:hAnsi="Calibri"/>
-          <w:color w:val="1F2937"/>
-          <w:sz w:val="20"/>
-          <w:szCs w:val="20"/>
-        </w:rPr>
-        <w:t xml:space="preserve">Contributed to a full-stack fashion storefront as part of a three-person client team: built product pages and storefront views in React, developed REST API endpoints, and implemented user authentication and cart-to-checkout flow.</w:t>
-      </w:r>
-    </w:p>
-    <w:p>
-      <w:pPr>
-        <w:spacing w:after="50" w:before="0"/>
-      </w:pPr>
-    </w:p>
-    <w:p>
-      <w:pPr>
-        <w:tabs>
-          <w:tab w:val="right" w:pos="9026"/>
-        </w:tabs>
-        <w:spacing w:after="0" w:before="120"/>
-      </w:pPr>
-      <w:r>
-        <w:rPr>
-          <w:rFonts w:ascii="Calibri" w:cs="Calibri" w:eastAsia="Calibri" w:hAnsi="Calibri"/>
-          <w:b/>
-          <w:bCs/>
-          <w:color w:val="1F2937"/>
-          <w:sz w:val="21"/>
-          <w:szCs w:val="21"/>
-        </w:rPr>
-        <w:t xml:space="preserve">SelfMatrix — Personality Assessment Tool</w:t>
-      </w:r>
-      <w:r>
-        <w:rPr>
-          <w:rFonts w:ascii="Calibri" w:cs="Calibri" w:eastAsia="Calibri" w:hAnsi="Calibri"/>
-          <w:color w:val="6B7280"/>
-          <w:sz w:val="20"/>
-          <w:szCs w:val="20"/>
-        </w:rPr>
-        <w:t xml:space="preserve">  ·  </w:t>
-      </w:r>
-      <w:r>
-        <w:rPr>
-          <w:rFonts w:ascii="Calibri" w:cs="Calibri" w:eastAsia="Calibri" w:hAnsi="Calibri"/>
-          <w:color w:val="1A6647"/>
-          <w:sz w:val="20"/>
-          <w:szCs w:val="20"/>
-        </w:rPr>
-        <w:t xml:space="preserve">selfmatrix.vercel.app</w:t>
-      </w:r>
-      <w:r>
-        <w:rPr>
-          <w:sz w:val="20"/>
-          <w:szCs w:val="20"/>
-        </w:rPr>
-        <w:t xml:space="preserve">	</w:t>
-      </w:r>
-      <w:r>
-        <w:rPr>
-          <w:rFonts w:ascii="Calibri" w:cs="Calibri" w:eastAsia="Calibri" w:hAnsi="Calibri"/>
-          <w:i/>
-          <w:iCs/>
-          <w:color w:val="6B7280"/>
-          <w:sz w:val="18"/>
-          <w:szCs w:val="18"/>
-        </w:rPr>
-        <w:t xml:space="preserve">React · TypeScript · Express.js · Supabase</w:t>
+        <w:spacing w:after="32" w:before="0" w:line="248" w:lineRule="auto"/>
+        <w:ind w:left="340" w:hanging="180"/>
+      </w:pPr>
+      <w:r>
+        <w:rPr>
+          <w:rFonts w:ascii="Calibri" w:cs="Calibri" w:eastAsia="Calibri" w:hAnsi="Calibri"/>
+          <w:color w:val="1F2937"/>
+          <w:sz w:val="19"/>
+          <w:szCs w:val="19"/>
+        </w:rPr>
+        <w:t xml:space="preserve">Contributed to a full-stack fashion platform in a three-member client team: developed storefront pages, product catalog views, Express REST endpoints, and modeled MongoDB product/user schemas.</w:t>
       </w:r>
     </w:p>
     <w:p>
@@ -920,37 +956,17 @@
           <w:ilvl w:val="0"/>
           <w:numId w:val="1"/>
         </w:numPr>
-        <w:spacing w:after="36" w:before="0" w:line="252" w:lineRule="auto"/>
-        <w:ind w:left="360" w:hanging="180"/>
-      </w:pPr>
-      <w:r>
-        <w:rPr>
-          <w:rFonts w:ascii="Calibri" w:cs="Calibri" w:eastAsia="Calibri" w:hAnsi="Calibri"/>
-          <w:color w:val="1F2937"/>
-          <w:sz w:val="20"/>
-          <w:szCs w:val="20"/>
-        </w:rPr>
-        <w:t xml:space="preserve">Scenario-based tool that measures communication style across four archetypes using a weighted scoring algorithm; after the 32-question assessment, calls an LLM API to generate a plain-language explanation of the user's result profile.</w:t>
-      </w:r>
-    </w:p>
-    <w:p>
-      <w:pPr>
-        <w:pStyle w:val="ListParagraph"/>
-        <w:numPr>
-          <w:ilvl w:val="0"/>
-          <w:numId w:val="1"/>
-        </w:numPr>
-        <w:spacing w:after="36" w:before="0" w:line="252" w:lineRule="auto"/>
-        <w:ind w:left="360" w:hanging="180"/>
-      </w:pPr>
-      <w:r>
-        <w:rPr>
-          <w:rFonts w:ascii="Calibri" w:cs="Calibri" w:eastAsia="Calibri" w:hAnsi="Calibri"/>
-          <w:color w:val="1F2937"/>
-          <w:sz w:val="20"/>
-          <w:szCs w:val="20"/>
-        </w:rPr>
-        <w:t xml:space="preserve">Results and archetype explanations are shareable via encoded URL without requiring user registration.</w:t>
+        <w:spacing w:after="32" w:before="0" w:line="248" w:lineRule="auto"/>
+        <w:ind w:left="340" w:hanging="180"/>
+      </w:pPr>
+      <w:r>
+        <w:rPr>
+          <w:rFonts w:ascii="Calibri" w:cs="Calibri" w:eastAsia="Calibri" w:hAnsi="Calibri"/>
+          <w:color w:val="1F2937"/>
+          <w:sz w:val="19"/>
+          <w:szCs w:val="19"/>
+        </w:rPr>
+        <w:t xml:space="preserve">Implemented user authentication and cart-to-checkout flows; managed production build deployment on cPanel hosting.</w:t>
       </w:r>
     </w:p>
     <w:p>
@@ -958,12 +974,12 @@
         <w:pBdr>
           <w:top w:val="single" w:color="1A6647" w:sz="6" w:space="0"/>
         </w:pBdr>
-        <w:spacing w:after="0" w:before="220"/>
-      </w:pPr>
-    </w:p>
-    <w:p>
-      <w:pPr>
-        <w:spacing w:after="80" w:before="40"/>
+        <w:spacing w:after="0" w:before="200"/>
+      </w:pPr>
+    </w:p>
+    <w:p>
+      <w:pPr>
+        <w:spacing w:after="60" w:before="40"/>
       </w:pPr>
       <w:r>
         <w:rPr>
@@ -983,18 +999,18 @@
         <w:tabs>
           <w:tab w:val="right" w:pos="9026"/>
         </w:tabs>
-        <w:spacing w:after="0" w:before="120"/>
-      </w:pPr>
-      <w:r>
-        <w:rPr>
-          <w:rFonts w:ascii="Calibri" w:cs="Calibri" w:eastAsia="Calibri" w:hAnsi="Calibri"/>
-          <w:b/>
-          <w:bCs/>
-          <w:color w:val="1F2937"/>
-          <w:sz w:val="23"/>
-          <w:szCs w:val="23"/>
-        </w:rPr>
-        <w:t xml:space="preserve">M.Sc. Engineering — Information &amp; Communication Technology</w:t>
+        <w:spacing w:after="0" w:before="100"/>
+      </w:pPr>
+      <w:r>
+        <w:rPr>
+          <w:rFonts w:ascii="Calibri" w:cs="Calibri" w:eastAsia="Calibri" w:hAnsi="Calibri"/>
+          <w:b/>
+          <w:bCs/>
+          <w:color w:val="1F2937"/>
+          <w:sz w:val="22"/>
+          <w:szCs w:val="22"/>
+        </w:rPr>
+        <w:t xml:space="preserve">M.Sc. in Information &amp; Communication Technology</w:t>
       </w:r>
       <w:r>
         <w:rPr>
@@ -1012,12 +1028,12 @@
           <w:sz w:val="20"/>
           <w:szCs w:val="20"/>
         </w:rPr>
-        <w:t xml:space="preserve">2025 — Present</w:t>
-      </w:r>
-    </w:p>
-    <w:p>
-      <w:pPr>
-        <w:spacing w:after="60" w:before="0"/>
+        <w:t xml:space="preserve">2025 – Present</w:t>
+      </w:r>
+    </w:p>
+    <w:p>
+      <w:pPr>
+        <w:spacing w:after="50" w:before="0"/>
       </w:pPr>
       <w:r>
         <w:rPr>
@@ -1026,7 +1042,7 @@
           <w:sz w:val="20"/>
           <w:szCs w:val="20"/>
         </w:rPr>
-        <w:t xml:space="preserve">Mawlana Bhashani Science &amp; Technology University, Bangladesh  ·  In progress</w:t>
+        <w:t xml:space="preserve">Mawlana Bhashani Science &amp; Technology University, Tangail · In progress</w:t>
       </w:r>
     </w:p>
     <w:p>
@@ -1039,15 +1055,15 @@
           <w:i w:val="false"/>
           <w:iCs w:val="false"/>
           <w:color w:val="4B5563"/>
-          <w:sz w:val="20"/>
-          <w:szCs w:val="20"/>
-        </w:rPr>
-        <w:t xml:space="preserve">Research: applied deep learning for medical imaging, computer vision, and network intrusion detection.</w:t>
-      </w:r>
-    </w:p>
-    <w:p>
-      <w:pPr>
-        <w:spacing w:after="60" w:before="0"/>
+          <w:sz w:val="19"/>
+          <w:szCs w:val="19"/>
+        </w:rPr>
+        <w:t xml:space="preserve">Research focus: applied deep learning for medical imaging, computer vision, and network security.</w:t>
+      </w:r>
+    </w:p>
+    <w:p>
+      <w:pPr>
+        <w:spacing w:after="50" w:before="0"/>
       </w:pPr>
     </w:p>
     <w:p>
@@ -1055,18 +1071,18 @@
         <w:tabs>
           <w:tab w:val="right" w:pos="9026"/>
         </w:tabs>
-        <w:spacing w:after="0" w:before="120"/>
-      </w:pPr>
-      <w:r>
-        <w:rPr>
-          <w:rFonts w:ascii="Calibri" w:cs="Calibri" w:eastAsia="Calibri" w:hAnsi="Calibri"/>
-          <w:b/>
-          <w:bCs/>
-          <w:color w:val="1F2937"/>
-          <w:sz w:val="23"/>
-          <w:szCs w:val="23"/>
-        </w:rPr>
-        <w:t xml:space="preserve">B.Sc. Engineering — Information &amp; Communication Technology</w:t>
+        <w:spacing w:after="0" w:before="100"/>
+      </w:pPr>
+      <w:r>
+        <w:rPr>
+          <w:rFonts w:ascii="Calibri" w:cs="Calibri" w:eastAsia="Calibri" w:hAnsi="Calibri"/>
+          <w:b/>
+          <w:bCs/>
+          <w:color w:val="1F2937"/>
+          <w:sz w:val="22"/>
+          <w:szCs w:val="22"/>
+        </w:rPr>
+        <w:t xml:space="preserve">B.Sc. in Information &amp; Communication Technology</w:t>
       </w:r>
       <w:r>
         <w:rPr>
@@ -1084,12 +1100,12 @@
           <w:sz w:val="20"/>
           <w:szCs w:val="20"/>
         </w:rPr>
-        <w:t xml:space="preserve">2020 — 2025</w:t>
-      </w:r>
-    </w:p>
-    <w:p>
-      <w:pPr>
-        <w:spacing w:after="60" w:before="0"/>
+        <w:t xml:space="preserve">2020 – 2025</w:t>
+      </w:r>
+    </w:p>
+    <w:p>
+      <w:pPr>
+        <w:spacing w:after="50" w:before="0"/>
       </w:pPr>
       <w:r>
         <w:rPr>
@@ -1098,7 +1114,7 @@
           <w:sz w:val="20"/>
           <w:szCs w:val="20"/>
         </w:rPr>
-        <w:t xml:space="preserve">Mawlana Bhashani Science &amp; Technology University, Bangladesh  ·  CGPA 3.65 / 4.00</w:t>
+        <w:t xml:space="preserve">Mawlana Bhashani Science &amp; Technology University, Tangail · Completed · CGPA 3.65 / 4.00</w:t>
       </w:r>
     </w:p>
     <w:p>
@@ -1111,10 +1127,10 @@
           <w:i w:val="false"/>
           <w:iCs w:val="false"/>
           <w:color w:val="4B5563"/>
-          <w:sz w:val="20"/>
-          <w:szCs w:val="20"/>
-        </w:rPr>
-        <w:t xml:space="preserve">Coursework: software engineering, data structures, algorithms, computer networks, databases.</w:t>
+          <w:sz w:val="19"/>
+          <w:szCs w:val="19"/>
+        </w:rPr>
+        <w:t xml:space="preserve">Coursework: software engineering, data structures, algorithms, computer networks, database systems.</w:t>
       </w:r>
     </w:p>
     <w:p>
@@ -1122,12 +1138,12 @@
         <w:pBdr>
           <w:top w:val="single" w:color="1A6647" w:sz="6" w:space="0"/>
         </w:pBdr>
-        <w:spacing w:after="0" w:before="220"/>
-      </w:pPr>
-    </w:p>
-    <w:p>
-      <w:pPr>
-        <w:spacing w:after="80" w:before="40"/>
+        <w:spacing w:after="0" w:before="200"/>
+      </w:pPr>
+    </w:p>
+    <w:p>
+      <w:pPr>
+        <w:spacing w:after="60" w:before="40"/>
       </w:pPr>
       <w:r>
         <w:rPr>
@@ -1139,12 +1155,12 @@
           <w:sz w:val="20"/>
           <w:szCs w:val="20"/>
         </w:rPr>
-        <w:t xml:space="preserve">RESEARCH PUBLICATIONS  (CO-AUTHOR, ALL 2025)</w:t>
-      </w:r>
-    </w:p>
-    <w:p>
-      <w:pPr>
-        <w:spacing w:after="0" w:before="40" w:line="252" w:lineRule="auto"/>
+        <w:t xml:space="preserve">RESEARCH PUBLICATIONS (CO-AUTHOR · ALL 2025)</w:t>
+      </w:r>
+    </w:p>
+    <w:p>
+      <w:pPr>
+        <w:spacing w:after="0" w:before="40" w:line="248" w:lineRule="auto"/>
         <w:ind w:left="280" w:hanging="180"/>
       </w:pPr>
       <w:r>
@@ -1161,9 +1177,11 @@
       <w:r>
         <w:rPr>
           <w:rFonts w:ascii="Calibri" w:cs="Calibri" w:eastAsia="Calibri" w:hAnsi="Calibri"/>
-          <w:color w:val="1F2937"/>
-          <w:sz w:val="20"/>
-          <w:szCs w:val="20"/>
+          <w:b/>
+          <w:bCs/>
+          <w:color w:val="1F2937"/>
+          <w:sz w:val="19"/>
+          <w:szCs w:val="19"/>
         </w:rPr>
         <w:t xml:space="preserve">Detection and Classification of Kidney Disease from CT Images: An Automated Deep Learning Approach</w:t>
       </w:r>
@@ -1171,8 +1189,8 @@
         <w:rPr>
           <w:rFonts w:ascii="Calibri" w:cs="Calibri" w:eastAsia="Calibri" w:hAnsi="Calibri"/>
           <w:color w:val="6B7280"/>
-          <w:sz w:val="20"/>
-          <w:szCs w:val="20"/>
+          <w:sz w:val="19"/>
+          <w:szCs w:val="19"/>
         </w:rPr>
         <w:t xml:space="preserve">  —  </w:t>
       </w:r>
@@ -1182,10 +1200,10 @@
           <w:i/>
           <w:iCs/>
           <w:color w:val="4B5563"/>
-          <w:sz w:val="20"/>
-          <w:szCs w:val="20"/>
-        </w:rPr>
-        <w:t xml:space="preserve">MDPI Technologies, Vol. 13, No. 11</w:t>
+          <w:sz w:val="19"/>
+          <w:szCs w:val="19"/>
+        </w:rPr>
+        <w:t xml:space="preserve">Technologies (MDPI), Vol. 13, Issue 11, Article 508 (2025)</w:t>
       </w:r>
       <w:r>
         <w:rPr>
@@ -1199,22 +1217,22 @@
     </w:p>
     <w:p>
       <w:pPr>
-        <w:spacing w:after="20" w:before="0"/>
+        <w:spacing w:after="24" w:before="0"/>
         <w:ind w:left="280"/>
       </w:pPr>
       <w:r>
         <w:rPr>
           <w:rFonts w:ascii="Calibri" w:cs="Calibri" w:eastAsia="Calibri" w:hAnsi="Calibri"/>
           <w:color w:val="4B5563"/>
-          <w:sz w:val="19"/>
-          <w:szCs w:val="19"/>
-        </w:rPr>
-        <w:t xml:space="preserve">DenseNet121 / EfficientNetB0 soft-voting ensemble for CT-based renal classification. 99.24% accuracy reported.</w:t>
-      </w:r>
-    </w:p>
-    <w:p>
-      <w:pPr>
-        <w:spacing w:after="0" w:before="40" w:line="252" w:lineRule="auto"/>
+          <w:sz w:val="18"/>
+          <w:szCs w:val="18"/>
+        </w:rPr>
+        <w:t xml:space="preserve">Co-author. DenseNet121 / EfficientNetB0 soft-voting ensemble for automated kidney disease classification from CT images; reported 99.24% diagnostic accuracy.</w:t>
+      </w:r>
+    </w:p>
+    <w:p>
+      <w:pPr>
+        <w:spacing w:after="0" w:before="40" w:line="248" w:lineRule="auto"/>
         <w:ind w:left="280" w:hanging="180"/>
       </w:pPr>
       <w:r>
@@ -1231,9 +1249,11 @@
       <w:r>
         <w:rPr>
           <w:rFonts w:ascii="Calibri" w:cs="Calibri" w:eastAsia="Calibri" w:hAnsi="Calibri"/>
-          <w:color w:val="1F2937"/>
-          <w:sz w:val="20"/>
-          <w:szCs w:val="20"/>
+          <w:b/>
+          <w:bCs/>
+          <w:color w:val="1F2937"/>
+          <w:sz w:val="19"/>
+          <w:szCs w:val="19"/>
         </w:rPr>
         <w:t xml:space="preserve">An IoT-Based Lung Cancer Detection System from CT Images Using Deep Learning</w:t>
       </w:r>
@@ -1241,8 +1261,8 @@
         <w:rPr>
           <w:rFonts w:ascii="Calibri" w:cs="Calibri" w:eastAsia="Calibri" w:hAnsi="Calibri"/>
           <w:color w:val="6B7280"/>
-          <w:sz w:val="20"/>
-          <w:szCs w:val="20"/>
+          <w:sz w:val="19"/>
+          <w:szCs w:val="19"/>
         </w:rPr>
         <w:t xml:space="preserve">  —  </w:t>
       </w:r>
@@ -1252,10 +1272,10 @@
           <w:i/>
           <w:iCs/>
           <w:color w:val="4B5563"/>
-          <w:sz w:val="20"/>
-          <w:szCs w:val="20"/>
-        </w:rPr>
-        <w:t xml:space="preserve">Springer Nature · ITSS-IoE 2025, Univ. of Wolverhampton, UK</w:t>
+          <w:sz w:val="19"/>
+          <w:szCs w:val="19"/>
+        </w:rPr>
+        <w:t xml:space="preserve">Springer Nature · ITSS-IoE 2025, University of Wolverhampton, UK (2025)</w:t>
       </w:r>
       <w:r>
         <w:rPr>
@@ -1269,22 +1289,22 @@
     </w:p>
     <w:p>
       <w:pPr>
-        <w:spacing w:after="20" w:before="0"/>
+        <w:spacing w:after="24" w:before="0"/>
         <w:ind w:left="280"/>
       </w:pPr>
       <w:r>
         <w:rPr>
           <w:rFonts w:ascii="Calibri" w:cs="Calibri" w:eastAsia="Calibri" w:hAnsi="Calibri"/>
           <w:color w:val="4B5563"/>
-          <w:sz w:val="19"/>
-          <w:szCs w:val="19"/>
-        </w:rPr>
-        <w:t xml:space="preserve">Hybrid ResNet152V2 / InceptionV3 with channel-spatial attention for lung CT classification. 98% accuracy reported.</w:t>
-      </w:r>
-    </w:p>
-    <w:p>
-      <w:pPr>
-        <w:spacing w:after="0" w:before="40" w:line="252" w:lineRule="auto"/>
+          <w:sz w:val="18"/>
+          <w:szCs w:val="18"/>
+        </w:rPr>
+        <w:t xml:space="preserve">Co-author. ResNet152V2 and InceptionV3 with a hybrid channel-spatial attention (HCSA) module; reported 98% classification accuracy on benchmark lung CT dataset.</w:t>
+      </w:r>
+    </w:p>
+    <w:p>
+      <w:pPr>
+        <w:spacing w:after="0" w:before="40" w:line="248" w:lineRule="auto"/>
         <w:ind w:left="280" w:hanging="180"/>
       </w:pPr>
       <w:r>
@@ -1301,9 +1321,11 @@
       <w:r>
         <w:rPr>
           <w:rFonts w:ascii="Calibri" w:cs="Calibri" w:eastAsia="Calibri" w:hAnsi="Calibri"/>
-          <w:color w:val="1F2937"/>
-          <w:sz w:val="20"/>
-          <w:szCs w:val="20"/>
+          <w:b/>
+          <w:bCs/>
+          <w:color w:val="1F2937"/>
+          <w:sz w:val="19"/>
+          <w:szCs w:val="19"/>
         </w:rPr>
         <w:t xml:space="preserve">Classification of Kidney Disease from CT Images: A Deep Learning-Based Comparative Analysis</w:t>
       </w:r>
@@ -1311,8 +1333,8 @@
         <w:rPr>
           <w:rFonts w:ascii="Calibri" w:cs="Calibri" w:eastAsia="Calibri" w:hAnsi="Calibri"/>
           <w:color w:val="6B7280"/>
-          <w:sz w:val="20"/>
-          <w:szCs w:val="20"/>
+          <w:sz w:val="19"/>
+          <w:szCs w:val="19"/>
         </w:rPr>
         <w:t xml:space="preserve">  —  </w:t>
       </w:r>
@@ -1322,10 +1344,10 @@
           <w:i/>
           <w:iCs/>
           <w:color w:val="4B5563"/>
-          <w:sz w:val="20"/>
-          <w:szCs w:val="20"/>
-        </w:rPr>
-        <w:t xml:space="preserve">IEEE ICSECS 2025, Malaysia</w:t>
+          <w:sz w:val="19"/>
+          <w:szCs w:val="19"/>
+        </w:rPr>
+        <w:t xml:space="preserve">IEEE ICSECS 2025, Pekan, Malaysia (2025)</w:t>
       </w:r>
       <w:r>
         <w:rPr>
@@ -1339,22 +1361,22 @@
     </w:p>
     <w:p>
       <w:pPr>
-        <w:spacing w:after="20" w:before="0"/>
+        <w:spacing w:after="24" w:before="0"/>
         <w:ind w:left="280"/>
       </w:pPr>
       <w:r>
         <w:rPr>
           <w:rFonts w:ascii="Calibri" w:cs="Calibri" w:eastAsia="Calibri" w:hAnsi="Calibri"/>
           <w:color w:val="4B5563"/>
-          <w:sz w:val="19"/>
-          <w:szCs w:val="19"/>
-        </w:rPr>
-        <w:t xml:space="preserve">Ensemble deep learning with explainable AI on 12,447 CT images. 98.98% accuracy, 98.60% F1-score reported.</w:t>
+          <w:sz w:val="18"/>
+          <w:szCs w:val="18"/>
+        </w:rPr>
+        <w:t xml:space="preserve">Co-author. Comparative deep learning analysis on 12,447 CT images combining ensemble classifiers with explainable AI (XAI); reported 98.98% accuracy and 98.60% F1-score.</w:t>
       </w:r>
     </w:p>
     <w:sectPr>
       <w:pgSz w:w="11906" w:h="16838" w:orient="portrait"/>
-      <w:pgMar w:top="748" w:right="892" w:bottom="748" w:left="892" w:header="708" w:footer="708" w:gutter="0"/>
+      <w:pgMar w:top="720" w:right="863" w:bottom="720" w:left="863" w:header="708" w:footer="708" w:gutter="0"/>
       <w:pgNumType/>
       <w:docGrid w:linePitch="360"/>
     </w:sectPr>
@@ -1544,7 +1566,7 @@
     </w:rPrDefault>
     <w:pPrDefault>
       <w:pPr>
-        <w:spacing w:line="252" w:lineRule="auto"/>
+        <w:spacing w:line="248" w:lineRule="auto"/>
       </w:pPr>
     </w:pPrDefault>
   </w:docDefaults>

</xml_diff>